<commit_message>
Update final version document
</commit_message>
<xml_diff>
--- a/ISM4545 - Midterm Project - Final Version.docx
+++ b/ISM4545 - Midterm Project - Final Version.docx
@@ -1,6 +1,6 @@
 
 <file path=word/document.xml><?xml version="1.0" encoding="utf-8"?>
-<w:document xmlns:wpc="http://schemas.microsoft.com/office/word/2010/wordprocessingCanvas" xmlns:cx="http://schemas.microsoft.com/office/drawing/2014/chartex" xmlns:cx1="http://schemas.microsoft.com/office/drawing/2015/9/8/chartex" xmlns:cx2="http://schemas.microsoft.com/office/drawing/2015/10/21/chartex" xmlns:cx3="http://schemas.microsoft.com/office/drawing/2016/5/9/chartex" xmlns:cx4="http://schemas.microsoft.com/office/drawing/2016/5/10/chartex" xmlns:cx5="http://schemas.microsoft.com/office/drawing/2016/5/11/chartex" xmlns:cx6="http://schemas.microsoft.com/office/drawing/2016/5/12/chartex" xmlns:cx7="http://schemas.microsoft.com/office/drawing/2016/5/13/chartex" xmlns:cx8="http://schemas.microsoft.com/office/drawing/2016/5/14/chartex" xmlns:mc="http://schemas.openxmlformats.org/markup-compatibility/2006" xmlns:aink="http://schemas.microsoft.com/office/drawing/2016/ink" xmlns:am3d="http://schemas.microsoft.com/office/drawing/2017/model3d" xmlns:o="urn:schemas-microsoft-com:office:office" xmlns:oel="http://schemas.microsoft.com/office/2019/extlst" xmlns:r="http://schemas.openxmlformats.org/officeDocument/2006/relationships" xmlns:m="http://schemas.openxmlformats.org/officeDocument/2006/math" xmlns:v="urn:schemas-microsoft-com:vml" xmlns:wp14="http://schemas.microsoft.com/office/word/2010/wordprocessingDrawing" xmlns:wp="http://schemas.openxmlformats.org/drawingml/2006/wordprocessingDrawing" xmlns:w10="urn:schemas-microsoft-com:office:word" xmlns:w="http://schemas.openxmlformats.org/wordprocessingml/2006/main" xmlns:w14="http://schemas.microsoft.com/office/word/2010/wordml" xmlns:w15="http://schemas.microsoft.com/office/word/2012/wordml" xmlns:w16cex="http://schemas.microsoft.com/office/word/2018/wordml/cex" xmlns:w16cid="http://schemas.microsoft.com/office/word/2016/wordml/cid" xmlns:w16="http://schemas.microsoft.com/office/word/2018/wordml" xmlns:w16du="http://schemas.microsoft.com/office/word/2023/wordml/word16du" xmlns:w16sdtdh="http://schemas.microsoft.com/office/word/2020/wordml/sdtdatahash" xmlns:w16sdtfl="http://schemas.microsoft.com/office/word/2024/wordml/sdtformatlock" xmlns:w16se="http://schemas.microsoft.com/office/word/2015/wordml/symex" xmlns:wpg="http://schemas.microsoft.com/office/word/2010/wordprocessingGroup" xmlns:wpi="http://schemas.microsoft.com/office/word/2010/wordprocessingInk" xmlns:wne="http://schemas.microsoft.com/office/word/2006/wordml" xmlns:wps="http://schemas.microsoft.com/office/word/2010/wordprocessingShape" mc:Ignorable="w14 w15 w16se w16cid w16 w16cex w16sdtdh w16sdtfl w16du wp14">
+<w:document xmlns:wpc="http://schemas.microsoft.com/office/word/2010/wordprocessingCanvas" xmlns:cx="http://schemas.microsoft.com/office/drawing/2014/chartex" xmlns:cx1="http://schemas.microsoft.com/office/drawing/2015/9/8/chartex" xmlns:cx2="http://schemas.microsoft.com/office/drawing/2015/10/21/chartex" xmlns:cx3="http://schemas.microsoft.com/office/drawing/2016/5/9/chartex" xmlns:cx4="http://schemas.microsoft.com/office/drawing/2016/5/10/chartex" xmlns:cx5="http://schemas.microsoft.com/office/drawing/2016/5/11/chartex" xmlns:cx6="http://schemas.microsoft.com/office/drawing/2016/5/12/chartex" xmlns:cx7="http://schemas.microsoft.com/office/drawing/2016/5/13/chartex" xmlns:cx8="http://schemas.microsoft.com/office/drawing/2016/5/14/chartex" xmlns:mc="http://schemas.openxmlformats.org/markup-compatibility/2006" xmlns:aink="http://schemas.microsoft.com/office/drawing/2016/ink" xmlns:am3d="http://schemas.microsoft.com/office/drawing/2017/model3d" xmlns:o="urn:schemas-microsoft-com:office:office" xmlns:oel="http://schemas.microsoft.com/office/2019/extlst" xmlns:r="http://schemas.openxmlformats.org/officeDocument/2006/relationships" xmlns:m="http://schemas.openxmlformats.org/officeDocument/2006/math" xmlns:v="urn:schemas-microsoft-com:vml" xmlns:wp14="http://schemas.microsoft.com/office/word/2010/wordprocessingDrawing" xmlns:wp="http://schemas.openxmlformats.org/drawingml/2006/wordprocessingDrawing" xmlns:w10="urn:schemas-microsoft-com:office:word" xmlns:w="http://schemas.openxmlformats.org/wordprocessingml/2006/main" xmlns:w14="http://schemas.microsoft.com/office/word/2010/wordml" xmlns:w15="http://schemas.microsoft.com/office/word/2012/wordml" xmlns:w16cex="http://schemas.microsoft.com/office/word/2018/wordml/cex" xmlns:w16cid="http://schemas.microsoft.com/office/word/2016/wordml/cid" xmlns:w16="http://schemas.microsoft.com/office/word/2018/wordml" xmlns:w16sdtdh="http://schemas.microsoft.com/office/word/2020/wordml/sdtdatahash" xmlns:w16se="http://schemas.microsoft.com/office/word/2015/wordml/symex" xmlns:wpg="http://schemas.microsoft.com/office/word/2010/wordprocessingGroup" xmlns:wpi="http://schemas.microsoft.com/office/word/2010/wordprocessingInk" xmlns:wne="http://schemas.microsoft.com/office/word/2006/wordml" xmlns:wps="http://schemas.microsoft.com/office/word/2010/wordprocessingShape" mc:Ignorable="w14 w15 w16se w16cid w16 w16cex w16sdtdh wp14">
   <w:body>
     <w:p>
       <w:pPr>
@@ -327,7 +327,23 @@
           <w:rFonts w:eastAsia="Times New Roman" w:cs="Times New Roman"/>
           <w:lang w:eastAsia="en-US"/>
         </w:rPr>
-        <w:t xml:space="preserve"> can use it directly as a key-value database for more control, or use a layer that makes it behave more like another type of database, such as a document database. </w:t>
+        <w:t xml:space="preserve"> can use it directly as a key-value database for more </w:t>
+      </w:r>
+      <w:proofErr w:type="gramStart"/>
+      <w:r>
+        <w:rPr>
+          <w:rFonts w:eastAsia="Times New Roman" w:cs="Times New Roman"/>
+          <w:lang w:eastAsia="en-US"/>
+        </w:rPr>
+        <w:t>control, or</w:t>
+      </w:r>
+      <w:proofErr w:type="gramEnd"/>
+      <w:r>
+        <w:rPr>
+          <w:rFonts w:eastAsia="Times New Roman" w:cs="Times New Roman"/>
+          <w:lang w:eastAsia="en-US"/>
+        </w:rPr>
+        <w:t xml:space="preserve"> use a layer that makes it behave more like another type of database, such as a document database. </w:t>
       </w:r>
     </w:p>
     <w:p>
@@ -347,7 +363,23 @@
           <w:rFonts w:eastAsia="Times New Roman" w:cs="Times New Roman"/>
           <w:lang w:eastAsia="en-US"/>
         </w:rPr>
-        <w:t xml:space="preserve">Its architecture reinforces that value by dividing the system into specialized roles, where each role handles a different job. This matters allows different </w:t>
+        <w:t xml:space="preserve">Its architecture reinforces that value by dividing the system into specialized roles, where each role handles a different job. </w:t>
+      </w:r>
+      <w:proofErr w:type="gramStart"/>
+      <w:r>
+        <w:rPr>
+          <w:rFonts w:eastAsia="Times New Roman" w:cs="Times New Roman"/>
+          <w:lang w:eastAsia="en-US"/>
+        </w:rPr>
+        <w:t>This matters</w:t>
+      </w:r>
+      <w:proofErr w:type="gramEnd"/>
+      <w:r>
+        <w:rPr>
+          <w:rFonts w:eastAsia="Times New Roman" w:cs="Times New Roman"/>
+          <w:lang w:eastAsia="en-US"/>
+        </w:rPr>
+        <w:t xml:space="preserve"> allows different </w:t>
       </w:r>
       <w:r>
         <w:rPr>
@@ -384,12 +416,21 @@
           <w:lang w:eastAsia="en-US"/>
         </w:rPr>
       </w:pPr>
+      <w:proofErr w:type="gramStart"/>
       <w:r>
         <w:rPr>
           <w:rFonts w:eastAsia="Times New Roman" w:cs="Times New Roman"/>
           <w:lang w:eastAsia="en-US"/>
         </w:rPr>
-        <w:t>So the deeper point is that FoundationDB is designed so correctness, performance, and scalability are built into the system from the start.</w:t>
+        <w:t>So</w:t>
+      </w:r>
+      <w:proofErr w:type="gramEnd"/>
+      <w:r>
+        <w:rPr>
+          <w:rFonts w:eastAsia="Times New Roman" w:cs="Times New Roman"/>
+          <w:lang w:eastAsia="en-US"/>
+        </w:rPr>
+        <w:t xml:space="preserve"> the deeper point is that FoundationDB is designed so correctness, performance, and scalability are built into the system from the start.</w:t>
       </w:r>
     </w:p>
     <w:p>
@@ -595,7 +636,15 @@
           <w:sz w:val="21"/>
           <w:szCs w:val="21"/>
         </w:rPr>
-        <w:t xml:space="preserve"> The system relies on a </w:t>
+        <w:t xml:space="preserve"> The system relies on </w:t>
+      </w:r>
+      <w:proofErr w:type="gramStart"/>
+      <w:r>
+        <w:rPr>
+          <w:sz w:val="21"/>
+          <w:szCs w:val="21"/>
+        </w:rPr>
+        <w:t xml:space="preserve">a </w:t>
       </w:r>
       <w:r>
         <w:rPr>
@@ -604,7 +653,17 @@
           <w:sz w:val="21"/>
           <w:szCs w:val="21"/>
         </w:rPr>
-        <w:t>majority of Coordinators</w:t>
+        <w:t>majority of</w:t>
+      </w:r>
+      <w:proofErr w:type="gramEnd"/>
+      <w:r>
+        <w:rPr>
+          <w:b/>
+          <w:bCs/>
+          <w:sz w:val="21"/>
+          <w:szCs w:val="21"/>
+        </w:rPr>
+        <w:t xml:space="preserve"> Coordinators</w:t>
       </w:r>
       <w:r>
         <w:rPr>
@@ -737,6 +796,7 @@
         </w:rPr>
         <w:t xml:space="preserve"> Data is </w:t>
       </w:r>
+      <w:proofErr w:type="gramStart"/>
       <w:r>
         <w:rPr>
           <w:b/>
@@ -746,6 +806,7 @@
         </w:rPr>
         <w:t>range-partitioned</w:t>
       </w:r>
+      <w:proofErr w:type="gramEnd"/>
       <w:r>
         <w:rPr>
           <w:sz w:val="21"/>
@@ -825,7 +886,15 @@
         </w:drawing>
       </w:r>
       <w:r>
-        <w:t xml:space="preserve"> (subject to change)</w:t>
+        <w:t xml:space="preserve"> (</w:t>
+      </w:r>
+      <w:proofErr w:type="gramStart"/>
+      <w:r>
+        <w:t>subject</w:t>
+      </w:r>
+      <w:proofErr w:type="gramEnd"/>
+      <w:r>
+        <w:t xml:space="preserve"> to change)</w:t>
       </w:r>
     </w:p>
     <w:p/>
@@ -886,8 +955,9 @@
           <w:sz w:val="22"/>
           <w:szCs w:val="22"/>
         </w:rPr>
-        <w:t>In case of a network partition, only the majority of nodes can process writes, while minority nodes become unavailable to prevent inconsistencies.</w:t>
-      </w:r>
+        <w:t xml:space="preserve">In case of a network partition, only </w:t>
+      </w:r>
+      <w:proofErr w:type="gramStart"/>
       <w:r>
         <w:rPr>
           <w:rFonts w:ascii="Lato" w:eastAsia="Lato" w:hAnsi="Lato" w:cs="Lato"/>
@@ -895,8 +965,9 @@
           <w:sz w:val="22"/>
           <w:szCs w:val="22"/>
         </w:rPr>
-        <w:t xml:space="preserve"> </w:t>
-      </w:r>
+        <w:t>the majority of</w:t>
+      </w:r>
+      <w:proofErr w:type="gramEnd"/>
       <w:r>
         <w:rPr>
           <w:rFonts w:ascii="Lato" w:eastAsia="Lato" w:hAnsi="Lato" w:cs="Lato"/>
@@ -904,13 +975,7 @@
           <w:sz w:val="22"/>
           <w:szCs w:val="22"/>
         </w:rPr>
-        <w:t>This is like PostgreSQL, which also focuses on strong consistency, but PostgreSQL doesn’t scale horizontally as well.</w:t>
-      </w:r>
-      <w:r>
-        <w:br/>
-      </w:r>
-      <w:r>
-        <w:tab/>
+        <w:t xml:space="preserve"> nodes can process writes, while minority nodes become unavailable to prevent inconsistencies.</w:t>
       </w:r>
       <w:r>
         <w:rPr>
@@ -919,19 +984,8 @@
           <w:sz w:val="22"/>
           <w:szCs w:val="22"/>
         </w:rPr>
-        <w:t>On the other hand, Cassandra is an AP system, prioritizing availability and allowing eventual consistency. So overall, FoundationDB sits in the middle - it provides strong consistency like PostgreSQL, but with the scalability of distributed systems.</w:t>
-      </w:r>
-    </w:p>
-    <w:p>
-      <w:pPr>
-        <w:spacing w:after="0"/>
-      </w:pPr>
-    </w:p>
-    <w:p>
-      <w:pPr>
-        <w:spacing w:after="0"/>
-        <w:ind w:firstLine="720"/>
-      </w:pPr>
+        <w:t xml:space="preserve"> </w:t>
+      </w:r>
       <w:r>
         <w:rPr>
           <w:rFonts w:ascii="Lato" w:eastAsia="Lato" w:hAnsi="Lato" w:cs="Lato"/>
@@ -939,10 +993,13 @@
           <w:sz w:val="22"/>
           <w:szCs w:val="22"/>
         </w:rPr>
-        <w:t>Unlike PostgreSQL, FoundationDB does not support SQL natively. Instead, it uses a key-value model, and SQL functionality must be added through external layers like the Record Layer.</w:t>
+        <w:t>This is like PostgreSQL, which also focuses on strong consistency, but PostgreSQL doesn’t scale horizontally as well.</w:t>
       </w:r>
       <w:r>
         <w:br/>
+      </w:r>
+      <w:r>
+        <w:tab/>
       </w:r>
       <w:r>
         <w:rPr>
@@ -951,8 +1008,19 @@
           <w:sz w:val="22"/>
           <w:szCs w:val="22"/>
         </w:rPr>
-        <w:t>This means features like joins, window functions, and stored procedures are not directly available.</w:t>
-      </w:r>
+        <w:t>On the other hand, Cassandra is an AP system, prioritizing availability and allowing eventual consistency. So overall, FoundationDB sits in the middle - it provides strong consistency like PostgreSQL, but with the scalability of distributed systems.</w:t>
+      </w:r>
+    </w:p>
+    <w:p>
+      <w:pPr>
+        <w:spacing w:after="0"/>
+      </w:pPr>
+    </w:p>
+    <w:p>
+      <w:pPr>
+        <w:spacing w:after="0"/>
+        <w:ind w:firstLine="720"/>
+      </w:pPr>
       <w:r>
         <w:rPr>
           <w:rFonts w:ascii="Lato" w:eastAsia="Lato" w:hAnsi="Lato" w:cs="Lato"/>
@@ -960,10 +1028,10 @@
           <w:sz w:val="22"/>
           <w:szCs w:val="22"/>
         </w:rPr>
-        <w:t xml:space="preserve"> </w:t>
-      </w:r>
-      <w:r>
-        <w:tab/>
+        <w:t>Unlike PostgreSQL, FoundationDB does not support SQL natively. Instead, it uses a key-value model, and SQL functionality must be added through external layers like the Record Layer.</w:t>
+      </w:r>
+      <w:r>
+        <w:br/>
       </w:r>
       <w:r>
         <w:rPr>
@@ -972,7 +1040,48 @@
           <w:sz w:val="22"/>
           <w:szCs w:val="22"/>
         </w:rPr>
-        <w:t>Because of this, developers must design data models based on access patterns, similar to Cassandra.</w:t>
+        <w:t>This means features like joins, window functions, and stored procedures are not directly available.</w:t>
+      </w:r>
+      <w:r>
+        <w:rPr>
+          <w:rFonts w:ascii="Lato" w:eastAsia="Lato" w:hAnsi="Lato" w:cs="Lato"/>
+          <w:color w:val="000000" w:themeColor="text1"/>
+          <w:sz w:val="22"/>
+          <w:szCs w:val="22"/>
+        </w:rPr>
+        <w:t xml:space="preserve"> </w:t>
+      </w:r>
+      <w:r>
+        <w:tab/>
+      </w:r>
+      <w:r>
+        <w:rPr>
+          <w:rFonts w:ascii="Lato" w:eastAsia="Lato" w:hAnsi="Lato" w:cs="Lato"/>
+          <w:color w:val="000000" w:themeColor="text1"/>
+          <w:sz w:val="22"/>
+          <w:szCs w:val="22"/>
+        </w:rPr>
+        <w:t xml:space="preserve">Because of this, developers must design data models based on access patterns, </w:t>
+      </w:r>
+      <w:proofErr w:type="gramStart"/>
+      <w:r>
+        <w:rPr>
+          <w:rFonts w:ascii="Lato" w:eastAsia="Lato" w:hAnsi="Lato" w:cs="Lato"/>
+          <w:color w:val="000000" w:themeColor="text1"/>
+          <w:sz w:val="22"/>
+          <w:szCs w:val="22"/>
+        </w:rPr>
+        <w:t>similar to</w:t>
+      </w:r>
+      <w:proofErr w:type="gramEnd"/>
+      <w:r>
+        <w:rPr>
+          <w:rFonts w:ascii="Lato" w:eastAsia="Lato" w:hAnsi="Lato" w:cs="Lato"/>
+          <w:color w:val="000000" w:themeColor="text1"/>
+          <w:sz w:val="22"/>
+          <w:szCs w:val="22"/>
+        </w:rPr>
+        <w:t xml:space="preserve"> Cassandra.</w:t>
       </w:r>
       <w:r>
         <w:rPr>
@@ -1038,8 +1147,16 @@
         <w:rPr>
           <w:rFonts w:ascii="Aptos" w:eastAsia="Aptos" w:hAnsi="Aptos" w:cs="Aptos"/>
         </w:rPr>
-        <w:t>Key ranges distributed across servers</w:t>
-      </w:r>
+        <w:t xml:space="preserve">Key ranges distributed across </w:t>
+      </w:r>
+      <w:proofErr w:type="gramStart"/>
+      <w:r>
+        <w:rPr>
+          <w:rFonts w:ascii="Aptos" w:eastAsia="Aptos" w:hAnsi="Aptos" w:cs="Aptos"/>
+        </w:rPr>
+        <w:t>servers</w:t>
+      </w:r>
+      <w:proofErr w:type="gramEnd"/>
     </w:p>
     <w:p>
       <w:pPr>
@@ -1057,8 +1174,16 @@
         <w:rPr>
           <w:rFonts w:ascii="Aptos" w:eastAsia="Aptos" w:hAnsi="Aptos" w:cs="Aptos"/>
         </w:rPr>
-        <w:t>Rebalancing is automatic when nodes added/removed</w:t>
-      </w:r>
+        <w:t>Rebalancing is automatic when nodes added/</w:t>
+      </w:r>
+      <w:proofErr w:type="gramStart"/>
+      <w:r>
+        <w:rPr>
+          <w:rFonts w:ascii="Aptos" w:eastAsia="Aptos" w:hAnsi="Aptos" w:cs="Aptos"/>
+        </w:rPr>
+        <w:t>removed</w:t>
+      </w:r>
+      <w:proofErr w:type="gramEnd"/>
     </w:p>
     <w:p>
       <w:pPr>
@@ -1134,7 +1259,13 @@
         <w:rPr>
           <w:rFonts w:ascii="Aptos" w:eastAsia="Aptos" w:hAnsi="Aptos" w:cs="Aptos"/>
         </w:rPr>
-        <w:t>Full ACID transactions with strict serializability</w:t>
+        <w:t xml:space="preserve">Full ACID transactions with strict </w:t>
+      </w:r>
+      <w:r>
+        <w:rPr>
+          <w:rFonts w:ascii="Aptos" w:eastAsia="Aptos" w:hAnsi="Aptos" w:cs="Aptos"/>
+        </w:rPr>
+        <w:t>serializability</w:t>
       </w:r>
     </w:p>
     <w:p>
@@ -1191,7 +1322,21 @@
         <w:rPr>
           <w:rFonts w:ascii="Aptos" w:eastAsia="Aptos" w:hAnsi="Aptos" w:cs="Aptos"/>
         </w:rPr>
-        <w:t>vs PostgreSQL: strong but single-node | vs Cassandra: fast but weaker consistency</w:t>
+        <w:t xml:space="preserve">vs PostgreSQL: strong but </w:t>
+      </w:r>
+      <w:proofErr w:type="gramStart"/>
+      <w:r>
+        <w:rPr>
+          <w:rFonts w:ascii="Aptos" w:eastAsia="Aptos" w:hAnsi="Aptos" w:cs="Aptos"/>
+        </w:rPr>
+        <w:t>single-node</w:t>
+      </w:r>
+      <w:proofErr w:type="gramEnd"/>
+      <w:r>
+        <w:rPr>
+          <w:rFonts w:ascii="Aptos" w:eastAsia="Aptos" w:hAnsi="Aptos" w:cs="Aptos"/>
+        </w:rPr>
+        <w:t xml:space="preserve"> | vs Cassandra: fast but weaker consistency</w:t>
       </w:r>
     </w:p>
     <w:p>
@@ -1239,7 +1384,23 @@
           <w:sz w:val="24"/>
           <w:szCs w:val="24"/>
         </w:rPr>
-        <w:t>What are the trade-o</w:t>
+        <w:t xml:space="preserve">What </w:t>
+      </w:r>
+      <w:proofErr w:type="gramStart"/>
+      <w:r>
+        <w:rPr>
+          <w:sz w:val="24"/>
+          <w:szCs w:val="24"/>
+        </w:rPr>
+        <w:t>are</w:t>
+      </w:r>
+      <w:proofErr w:type="gramEnd"/>
+      <w:r>
+        <w:rPr>
+          <w:sz w:val="24"/>
+          <w:szCs w:val="24"/>
+        </w:rPr>
+        <w:t xml:space="preserve"> the trade-o</w:t>
       </w:r>
       <w:r>
         <w:rPr>
@@ -1882,7 +2043,7 @@
 </file>
 
 <file path=word/comments.xml><?xml version="1.0" encoding="utf-8"?>
-<w:comments xmlns:wpc="http://schemas.microsoft.com/office/word/2010/wordprocessingCanvas" xmlns:cx="http://schemas.microsoft.com/office/drawing/2014/chartex" xmlns:cx1="http://schemas.microsoft.com/office/drawing/2015/9/8/chartex" xmlns:cx2="http://schemas.microsoft.com/office/drawing/2015/10/21/chartex" xmlns:cx3="http://schemas.microsoft.com/office/drawing/2016/5/9/chartex" xmlns:cx4="http://schemas.microsoft.com/office/drawing/2016/5/10/chartex" xmlns:cx5="http://schemas.microsoft.com/office/drawing/2016/5/11/chartex" xmlns:cx6="http://schemas.microsoft.com/office/drawing/2016/5/12/chartex" xmlns:cx7="http://schemas.microsoft.com/office/drawing/2016/5/13/chartex" xmlns:cx8="http://schemas.microsoft.com/office/drawing/2016/5/14/chartex" xmlns:mc="http://schemas.openxmlformats.org/markup-compatibility/2006" xmlns:aink="http://schemas.microsoft.com/office/drawing/2016/ink" xmlns:am3d="http://schemas.microsoft.com/office/drawing/2017/model3d" xmlns:o="urn:schemas-microsoft-com:office:office" xmlns:oel="http://schemas.microsoft.com/office/2019/extlst" xmlns:r="http://schemas.openxmlformats.org/officeDocument/2006/relationships" xmlns:m="http://schemas.openxmlformats.org/officeDocument/2006/math" xmlns:v="urn:schemas-microsoft-com:vml" xmlns:wp14="http://schemas.microsoft.com/office/word/2010/wordprocessingDrawing" xmlns:wp="http://schemas.openxmlformats.org/drawingml/2006/wordprocessingDrawing" xmlns:w10="urn:schemas-microsoft-com:office:word" xmlns:w="http://schemas.openxmlformats.org/wordprocessingml/2006/main" xmlns:w14="http://schemas.microsoft.com/office/word/2010/wordml" xmlns:w15="http://schemas.microsoft.com/office/word/2012/wordml" xmlns:w16cex="http://schemas.microsoft.com/office/word/2018/wordml/cex" xmlns:w16cid="http://schemas.microsoft.com/office/word/2016/wordml/cid" xmlns:w16="http://schemas.microsoft.com/office/word/2018/wordml" xmlns:w16du="http://schemas.microsoft.com/office/word/2023/wordml/word16du" xmlns:w16sdtdh="http://schemas.microsoft.com/office/word/2020/wordml/sdtdatahash" xmlns:w16sdtfl="http://schemas.microsoft.com/office/word/2024/wordml/sdtformatlock" xmlns:w16se="http://schemas.microsoft.com/office/word/2015/wordml/symex" xmlns:wpg="http://schemas.microsoft.com/office/word/2010/wordprocessingGroup" xmlns:wpi="http://schemas.microsoft.com/office/word/2010/wordprocessingInk" xmlns:wne="http://schemas.microsoft.com/office/word/2006/wordml" xmlns:wps="http://schemas.microsoft.com/office/word/2010/wordprocessingShape" mc:Ignorable="w14 w15 w16se w16cid w16 w16cex w16sdtdh w16sdtfl w16du wp14">
+<w:comments xmlns:wpc="http://schemas.microsoft.com/office/word/2010/wordprocessingCanvas" xmlns:cx="http://schemas.microsoft.com/office/drawing/2014/chartex" xmlns:cx1="http://schemas.microsoft.com/office/drawing/2015/9/8/chartex" xmlns:cx2="http://schemas.microsoft.com/office/drawing/2015/10/21/chartex" xmlns:cx3="http://schemas.microsoft.com/office/drawing/2016/5/9/chartex" xmlns:cx4="http://schemas.microsoft.com/office/drawing/2016/5/10/chartex" xmlns:cx5="http://schemas.microsoft.com/office/drawing/2016/5/11/chartex" xmlns:cx6="http://schemas.microsoft.com/office/drawing/2016/5/12/chartex" xmlns:cx7="http://schemas.microsoft.com/office/drawing/2016/5/13/chartex" xmlns:cx8="http://schemas.microsoft.com/office/drawing/2016/5/14/chartex" xmlns:mc="http://schemas.openxmlformats.org/markup-compatibility/2006" xmlns:aink="http://schemas.microsoft.com/office/drawing/2016/ink" xmlns:am3d="http://schemas.microsoft.com/office/drawing/2017/model3d" xmlns:o="urn:schemas-microsoft-com:office:office" xmlns:oel="http://schemas.microsoft.com/office/2019/extlst" xmlns:r="http://schemas.openxmlformats.org/officeDocument/2006/relationships" xmlns:m="http://schemas.openxmlformats.org/officeDocument/2006/math" xmlns:v="urn:schemas-microsoft-com:vml" xmlns:wp14="http://schemas.microsoft.com/office/word/2010/wordprocessingDrawing" xmlns:wp="http://schemas.openxmlformats.org/drawingml/2006/wordprocessingDrawing" xmlns:w10="urn:schemas-microsoft-com:office:word" xmlns:w="http://schemas.openxmlformats.org/wordprocessingml/2006/main" xmlns:w14="http://schemas.microsoft.com/office/word/2010/wordml" xmlns:w15="http://schemas.microsoft.com/office/word/2012/wordml" xmlns:w16cex="http://schemas.microsoft.com/office/word/2018/wordml/cex" xmlns:w16cid="http://schemas.microsoft.com/office/word/2016/wordml/cid" xmlns:w16="http://schemas.microsoft.com/office/word/2018/wordml" xmlns:w16sdtdh="http://schemas.microsoft.com/office/word/2020/wordml/sdtdatahash" xmlns:w16se="http://schemas.microsoft.com/office/word/2015/wordml/symex" xmlns:wpg="http://schemas.microsoft.com/office/word/2010/wordprocessingGroup" xmlns:wpi="http://schemas.microsoft.com/office/word/2010/wordprocessingInk" xmlns:wne="http://schemas.microsoft.com/office/word/2006/wordml" xmlns:wps="http://schemas.microsoft.com/office/word/2010/wordprocessingShape" mc:Ignorable="w14 w15 w16se w16cid w16 w16cex w16sdtdh wp14">
   <w:comment w:id="0" w:author="Helen Nguyen" w:date="2026-03-28T18:47:00Z" w:initials="NN">
     <w:p>
       <w:r>
@@ -1955,7 +2116,7 @@
 </file>
 
 <file path=word/commentsExtended.xml><?xml version="1.0" encoding="utf-8"?>
-<w15:commentsEx xmlns:wpc="http://schemas.microsoft.com/office/word/2010/wordprocessingCanvas" xmlns:cx="http://schemas.microsoft.com/office/drawing/2014/chartex" xmlns:cx1="http://schemas.microsoft.com/office/drawing/2015/9/8/chartex" xmlns:cx2="http://schemas.microsoft.com/office/drawing/2015/10/21/chartex" xmlns:cx3="http://schemas.microsoft.com/office/drawing/2016/5/9/chartex" xmlns:cx4="http://schemas.microsoft.com/office/drawing/2016/5/10/chartex" xmlns:cx5="http://schemas.microsoft.com/office/drawing/2016/5/11/chartex" xmlns:cx6="http://schemas.microsoft.com/office/drawing/2016/5/12/chartex" xmlns:cx7="http://schemas.microsoft.com/office/drawing/2016/5/13/chartex" xmlns:cx8="http://schemas.microsoft.com/office/drawing/2016/5/14/chartex" xmlns:mc="http://schemas.openxmlformats.org/markup-compatibility/2006" xmlns:aink="http://schemas.microsoft.com/office/drawing/2016/ink" xmlns:am3d="http://schemas.microsoft.com/office/drawing/2017/model3d" xmlns:o="urn:schemas-microsoft-com:office:office" xmlns:oel="http://schemas.microsoft.com/office/2019/extlst" xmlns:r="http://schemas.openxmlformats.org/officeDocument/2006/relationships" xmlns:m="http://schemas.openxmlformats.org/officeDocument/2006/math" xmlns:v="urn:schemas-microsoft-com:vml" xmlns:wp14="http://schemas.microsoft.com/office/word/2010/wordprocessingDrawing" xmlns:wp="http://schemas.openxmlformats.org/drawingml/2006/wordprocessingDrawing" xmlns:w10="urn:schemas-microsoft-com:office:word" xmlns:w="http://schemas.openxmlformats.org/wordprocessingml/2006/main" xmlns:w14="http://schemas.microsoft.com/office/word/2010/wordml" xmlns:w15="http://schemas.microsoft.com/office/word/2012/wordml" xmlns:w16cex="http://schemas.microsoft.com/office/word/2018/wordml/cex" xmlns:w16cid="http://schemas.microsoft.com/office/word/2016/wordml/cid" xmlns:w16="http://schemas.microsoft.com/office/word/2018/wordml" xmlns:w16du="http://schemas.microsoft.com/office/word/2023/wordml/word16du" xmlns:w16sdtdh="http://schemas.microsoft.com/office/word/2020/wordml/sdtdatahash" xmlns:w16sdtfl="http://schemas.microsoft.com/office/word/2024/wordml/sdtformatlock" xmlns:w16se="http://schemas.microsoft.com/office/word/2015/wordml/symex" xmlns:wpg="http://schemas.microsoft.com/office/word/2010/wordprocessingGroup" xmlns:wpi="http://schemas.microsoft.com/office/word/2010/wordprocessingInk" xmlns:wne="http://schemas.microsoft.com/office/word/2006/wordml" xmlns:wps="http://schemas.microsoft.com/office/word/2010/wordprocessingShape" mc:Ignorable="w14 w15 w16se w16cid w16 w16cex w16sdtdh w16sdtfl w16du wp14">
+<w15:commentsEx xmlns:wpc="http://schemas.microsoft.com/office/word/2010/wordprocessingCanvas" xmlns:cx="http://schemas.microsoft.com/office/drawing/2014/chartex" xmlns:cx1="http://schemas.microsoft.com/office/drawing/2015/9/8/chartex" xmlns:cx2="http://schemas.microsoft.com/office/drawing/2015/10/21/chartex" xmlns:cx3="http://schemas.microsoft.com/office/drawing/2016/5/9/chartex" xmlns:cx4="http://schemas.microsoft.com/office/drawing/2016/5/10/chartex" xmlns:cx5="http://schemas.microsoft.com/office/drawing/2016/5/11/chartex" xmlns:cx6="http://schemas.microsoft.com/office/drawing/2016/5/12/chartex" xmlns:cx7="http://schemas.microsoft.com/office/drawing/2016/5/13/chartex" xmlns:cx8="http://schemas.microsoft.com/office/drawing/2016/5/14/chartex" xmlns:mc="http://schemas.openxmlformats.org/markup-compatibility/2006" xmlns:aink="http://schemas.microsoft.com/office/drawing/2016/ink" xmlns:am3d="http://schemas.microsoft.com/office/drawing/2017/model3d" xmlns:o="urn:schemas-microsoft-com:office:office" xmlns:oel="http://schemas.microsoft.com/office/2019/extlst" xmlns:r="http://schemas.openxmlformats.org/officeDocument/2006/relationships" xmlns:m="http://schemas.openxmlformats.org/officeDocument/2006/math" xmlns:v="urn:schemas-microsoft-com:vml" xmlns:wp14="http://schemas.microsoft.com/office/word/2010/wordprocessingDrawing" xmlns:wp="http://schemas.openxmlformats.org/drawingml/2006/wordprocessingDrawing" xmlns:w10="urn:schemas-microsoft-com:office:word" xmlns:w="http://schemas.openxmlformats.org/wordprocessingml/2006/main" xmlns:w14="http://schemas.microsoft.com/office/word/2010/wordml" xmlns:w15="http://schemas.microsoft.com/office/word/2012/wordml" xmlns:w16cex="http://schemas.microsoft.com/office/word/2018/wordml/cex" xmlns:w16cid="http://schemas.microsoft.com/office/word/2016/wordml/cid" xmlns:w16="http://schemas.microsoft.com/office/word/2018/wordml" xmlns:w16sdtdh="http://schemas.microsoft.com/office/word/2020/wordml/sdtdatahash" xmlns:w16se="http://schemas.microsoft.com/office/word/2015/wordml/symex" xmlns:wpg="http://schemas.microsoft.com/office/word/2010/wordprocessingGroup" xmlns:wpi="http://schemas.microsoft.com/office/word/2010/wordprocessingInk" xmlns:wne="http://schemas.microsoft.com/office/word/2006/wordml" xmlns:wps="http://schemas.microsoft.com/office/word/2010/wordprocessingShape" mc:Ignorable="w14 w15 w16se w16cid w16 w16cex w16sdtdh wp14">
   <w15:commentEx w15:paraId="7E16C328" w15:done="0"/>
   <w15:commentEx w15:paraId="62C1AAF6" w15:done="0"/>
   <w15:commentEx w15:paraId="4FC961B7" w15:done="0"/>
@@ -1964,7 +2125,7 @@
 </file>
 
 <file path=word/commentsExtensible.xml><?xml version="1.0" encoding="utf-8"?>
-<w16cex:commentsExtensible xmlns:wpc="http://schemas.microsoft.com/office/word/2010/wordprocessingCanvas" xmlns:cx="http://schemas.microsoft.com/office/drawing/2014/chartex" xmlns:cx1="http://schemas.microsoft.com/office/drawing/2015/9/8/chartex" xmlns:cx2="http://schemas.microsoft.com/office/drawing/2015/10/21/chartex" xmlns:cx3="http://schemas.microsoft.com/office/drawing/2016/5/9/chartex" xmlns:cx4="http://schemas.microsoft.com/office/drawing/2016/5/10/chartex" xmlns:cx5="http://schemas.microsoft.com/office/drawing/2016/5/11/chartex" xmlns:cx6="http://schemas.microsoft.com/office/drawing/2016/5/12/chartex" xmlns:cx7="http://schemas.microsoft.com/office/drawing/2016/5/13/chartex" xmlns:cx8="http://schemas.microsoft.com/office/drawing/2016/5/14/chartex" xmlns:cr="http://schemas.microsoft.com/office/comments/2020/reactions" xmlns:mc="http://schemas.openxmlformats.org/markup-compatibility/2006" xmlns:aink="http://schemas.microsoft.com/office/drawing/2016/ink" xmlns:am3d="http://schemas.microsoft.com/office/drawing/2017/model3d" xmlns:o="urn:schemas-microsoft-com:office:office" xmlns:oel="http://schemas.microsoft.com/office/2019/extlst" xmlns:r="http://schemas.openxmlformats.org/officeDocument/2006/relationships" xmlns:m="http://schemas.openxmlformats.org/officeDocument/2006/math" xmlns:v="urn:schemas-microsoft-com:vml" xmlns:wp14="http://schemas.microsoft.com/office/word/2010/wordprocessingDrawing" xmlns:wp="http://schemas.openxmlformats.org/drawingml/2006/wordprocessingDrawing" xmlns:w10="urn:schemas-microsoft-com:office:word" xmlns:w="http://schemas.openxmlformats.org/wordprocessingml/2006/main" xmlns:w14="http://schemas.microsoft.com/office/word/2010/wordml" xmlns:w15="http://schemas.microsoft.com/office/word/2012/wordml" xmlns:w16cex="http://schemas.microsoft.com/office/word/2018/wordml/cex" xmlns:w16cid="http://schemas.microsoft.com/office/word/2016/wordml/cid" xmlns:w16="http://schemas.microsoft.com/office/word/2018/wordml" xmlns:w16du="http://schemas.microsoft.com/office/word/2023/wordml/word16du" xmlns:w16sdtdh="http://schemas.microsoft.com/office/word/2020/wordml/sdtdatahash" xmlns:w16sdtfl="http://schemas.microsoft.com/office/word/2024/wordml/sdtformatlock" xmlns:w16se="http://schemas.microsoft.com/office/word/2015/wordml/symex" xmlns:wpg="http://schemas.microsoft.com/office/word/2010/wordprocessingGroup" xmlns:wpi="http://schemas.microsoft.com/office/word/2010/wordprocessingInk" xmlns:wne="http://schemas.microsoft.com/office/word/2006/wordml" xmlns:wps="http://schemas.microsoft.com/office/word/2010/wordprocessingShape" mc:Ignorable="w14 w15 w16se w16cid w16 w16cex w16sdtdh w16sdtfl cr w16du wp14">
+<w16cex:commentsExtensible xmlns:wpc="http://schemas.microsoft.com/office/word/2010/wordprocessingCanvas" xmlns:cx="http://schemas.microsoft.com/office/drawing/2014/chartex" xmlns:cx1="http://schemas.microsoft.com/office/drawing/2015/9/8/chartex" xmlns:cx2="http://schemas.microsoft.com/office/drawing/2015/10/21/chartex" xmlns:cx3="http://schemas.microsoft.com/office/drawing/2016/5/9/chartex" xmlns:cx4="http://schemas.microsoft.com/office/drawing/2016/5/10/chartex" xmlns:cx5="http://schemas.microsoft.com/office/drawing/2016/5/11/chartex" xmlns:cx6="http://schemas.microsoft.com/office/drawing/2016/5/12/chartex" xmlns:cx7="http://schemas.microsoft.com/office/drawing/2016/5/13/chartex" xmlns:cx8="http://schemas.microsoft.com/office/drawing/2016/5/14/chartex" xmlns:mc="http://schemas.openxmlformats.org/markup-compatibility/2006" xmlns:aink="http://schemas.microsoft.com/office/drawing/2016/ink" xmlns:am3d="http://schemas.microsoft.com/office/drawing/2017/model3d" xmlns:o="urn:schemas-microsoft-com:office:office" xmlns:oel="http://schemas.microsoft.com/office/2019/extlst" xmlns:r="http://schemas.openxmlformats.org/officeDocument/2006/relationships" xmlns:m="http://schemas.openxmlformats.org/officeDocument/2006/math" xmlns:v="urn:schemas-microsoft-com:vml" xmlns:wp14="http://schemas.microsoft.com/office/word/2010/wordprocessingDrawing" xmlns:wp="http://schemas.openxmlformats.org/drawingml/2006/wordprocessingDrawing" xmlns:w10="urn:schemas-microsoft-com:office:word" xmlns:w="http://schemas.openxmlformats.org/wordprocessingml/2006/main" xmlns:w14="http://schemas.microsoft.com/office/word/2010/wordml" xmlns:w15="http://schemas.microsoft.com/office/word/2012/wordml" xmlns:w16cex="http://schemas.microsoft.com/office/word/2018/wordml/cex" xmlns:w16cid="http://schemas.microsoft.com/office/word/2016/wordml/cid" xmlns:w16="http://schemas.microsoft.com/office/word/2018/wordml" xmlns:w16sdtdh="http://schemas.microsoft.com/office/word/2020/wordml/sdtdatahash" xmlns:w16se="http://schemas.microsoft.com/office/word/2015/wordml/symex" xmlns:wpg="http://schemas.microsoft.com/office/word/2010/wordprocessingGroup" xmlns:wpi="http://schemas.microsoft.com/office/word/2010/wordprocessingInk" xmlns:wne="http://schemas.microsoft.com/office/word/2006/wordml" xmlns:wps="http://schemas.microsoft.com/office/word/2010/wordprocessingShape" mc:Ignorable="w14 w15 w16se w16cid w16 w16cex w16sdtdh wp14">
   <w16cex:commentExtensible w16cex:durableId="795C1F14" w16cex:dateUtc="2026-03-28T22:47:00Z"/>
   <w16cex:commentExtensible w16cex:durableId="45B7C8C5" w16cex:dateUtc="2026-03-28T22:47:00Z"/>
   <w16cex:commentExtensible w16cex:durableId="562A8B56" w16cex:dateUtc="2026-03-28T22:47:00Z"/>
@@ -1973,7 +2134,7 @@
 </file>
 
 <file path=word/commentsIds.xml><?xml version="1.0" encoding="utf-8"?>
-<w16cid:commentsIds xmlns:wpc="http://schemas.microsoft.com/office/word/2010/wordprocessingCanvas" xmlns:cx="http://schemas.microsoft.com/office/drawing/2014/chartex" xmlns:cx1="http://schemas.microsoft.com/office/drawing/2015/9/8/chartex" xmlns:cx2="http://schemas.microsoft.com/office/drawing/2015/10/21/chartex" xmlns:cx3="http://schemas.microsoft.com/office/drawing/2016/5/9/chartex" xmlns:cx4="http://schemas.microsoft.com/office/drawing/2016/5/10/chartex" xmlns:cx5="http://schemas.microsoft.com/office/drawing/2016/5/11/chartex" xmlns:cx6="http://schemas.microsoft.com/office/drawing/2016/5/12/chartex" xmlns:cx7="http://schemas.microsoft.com/office/drawing/2016/5/13/chartex" xmlns:cx8="http://schemas.microsoft.com/office/drawing/2016/5/14/chartex" xmlns:mc="http://schemas.openxmlformats.org/markup-compatibility/2006" xmlns:aink="http://schemas.microsoft.com/office/drawing/2016/ink" xmlns:am3d="http://schemas.microsoft.com/office/drawing/2017/model3d" xmlns:o="urn:schemas-microsoft-com:office:office" xmlns:oel="http://schemas.microsoft.com/office/2019/extlst" xmlns:r="http://schemas.openxmlformats.org/officeDocument/2006/relationships" xmlns:m="http://schemas.openxmlformats.org/officeDocument/2006/math" xmlns:v="urn:schemas-microsoft-com:vml" xmlns:wp14="http://schemas.microsoft.com/office/word/2010/wordprocessingDrawing" xmlns:wp="http://schemas.openxmlformats.org/drawingml/2006/wordprocessingDrawing" xmlns:w10="urn:schemas-microsoft-com:office:word" xmlns:w="http://schemas.openxmlformats.org/wordprocessingml/2006/main" xmlns:w14="http://schemas.microsoft.com/office/word/2010/wordml" xmlns:w15="http://schemas.microsoft.com/office/word/2012/wordml" xmlns:w16cex="http://schemas.microsoft.com/office/word/2018/wordml/cex" xmlns:w16cid="http://schemas.microsoft.com/office/word/2016/wordml/cid" xmlns:w16="http://schemas.microsoft.com/office/word/2018/wordml" xmlns:w16du="http://schemas.microsoft.com/office/word/2023/wordml/word16du" xmlns:w16sdtdh="http://schemas.microsoft.com/office/word/2020/wordml/sdtdatahash" xmlns:w16sdtfl="http://schemas.microsoft.com/office/word/2024/wordml/sdtformatlock" xmlns:w16se="http://schemas.microsoft.com/office/word/2015/wordml/symex" xmlns:wpg="http://schemas.microsoft.com/office/word/2010/wordprocessingGroup" xmlns:wpi="http://schemas.microsoft.com/office/word/2010/wordprocessingInk" xmlns:wne="http://schemas.microsoft.com/office/word/2006/wordml" xmlns:wps="http://schemas.microsoft.com/office/word/2010/wordprocessingShape" mc:Ignorable="w14 w15 w16se w16cid w16 w16cex w16sdtdh w16sdtfl w16du wp14">
+<w16cid:commentsIds xmlns:wpc="http://schemas.microsoft.com/office/word/2010/wordprocessingCanvas" xmlns:cx="http://schemas.microsoft.com/office/drawing/2014/chartex" xmlns:cx1="http://schemas.microsoft.com/office/drawing/2015/9/8/chartex" xmlns:cx2="http://schemas.microsoft.com/office/drawing/2015/10/21/chartex" xmlns:cx3="http://schemas.microsoft.com/office/drawing/2016/5/9/chartex" xmlns:cx4="http://schemas.microsoft.com/office/drawing/2016/5/10/chartex" xmlns:cx5="http://schemas.microsoft.com/office/drawing/2016/5/11/chartex" xmlns:cx6="http://schemas.microsoft.com/office/drawing/2016/5/12/chartex" xmlns:cx7="http://schemas.microsoft.com/office/drawing/2016/5/13/chartex" xmlns:cx8="http://schemas.microsoft.com/office/drawing/2016/5/14/chartex" xmlns:mc="http://schemas.openxmlformats.org/markup-compatibility/2006" xmlns:aink="http://schemas.microsoft.com/office/drawing/2016/ink" xmlns:am3d="http://schemas.microsoft.com/office/drawing/2017/model3d" xmlns:o="urn:schemas-microsoft-com:office:office" xmlns:oel="http://schemas.microsoft.com/office/2019/extlst" xmlns:r="http://schemas.openxmlformats.org/officeDocument/2006/relationships" xmlns:m="http://schemas.openxmlformats.org/officeDocument/2006/math" xmlns:v="urn:schemas-microsoft-com:vml" xmlns:wp14="http://schemas.microsoft.com/office/word/2010/wordprocessingDrawing" xmlns:wp="http://schemas.openxmlformats.org/drawingml/2006/wordprocessingDrawing" xmlns:w10="urn:schemas-microsoft-com:office:word" xmlns:w="http://schemas.openxmlformats.org/wordprocessingml/2006/main" xmlns:w14="http://schemas.microsoft.com/office/word/2010/wordml" xmlns:w15="http://schemas.microsoft.com/office/word/2012/wordml" xmlns:w16cex="http://schemas.microsoft.com/office/word/2018/wordml/cex" xmlns:w16cid="http://schemas.microsoft.com/office/word/2016/wordml/cid" xmlns:w16="http://schemas.microsoft.com/office/word/2018/wordml" xmlns:w16sdtdh="http://schemas.microsoft.com/office/word/2020/wordml/sdtdatahash" xmlns:w16se="http://schemas.microsoft.com/office/word/2015/wordml/symex" xmlns:wpg="http://schemas.microsoft.com/office/word/2010/wordprocessingGroup" xmlns:wpi="http://schemas.microsoft.com/office/word/2010/wordprocessingInk" xmlns:wne="http://schemas.microsoft.com/office/word/2006/wordml" xmlns:wps="http://schemas.microsoft.com/office/word/2010/wordprocessingShape" mc:Ignorable="w14 w15 w16se w16cid w16 w16cex w16sdtdh wp14">
   <w16cid:commentId w16cid:paraId="7E16C328" w16cid:durableId="795C1F14"/>
   <w16cid:commentId w16cid:paraId="62C1AAF6" w16cid:durableId="45B7C8C5"/>
   <w16cid:commentId w16cid:paraId="4FC961B7" w16cid:durableId="562A8B56"/>
@@ -1982,7 +2143,7 @@
 </file>
 
 <file path=word/numbering.xml><?xml version="1.0" encoding="utf-8"?>
-<w:numbering xmlns:wpc="http://schemas.microsoft.com/office/word/2010/wordprocessingCanvas" xmlns:cx="http://schemas.microsoft.com/office/drawing/2014/chartex" xmlns:cx1="http://schemas.microsoft.com/office/drawing/2015/9/8/chartex" xmlns:cx2="http://schemas.microsoft.com/office/drawing/2015/10/21/chartex" xmlns:cx3="http://schemas.microsoft.com/office/drawing/2016/5/9/chartex" xmlns:cx4="http://schemas.microsoft.com/office/drawing/2016/5/10/chartex" xmlns:cx5="http://schemas.microsoft.com/office/drawing/2016/5/11/chartex" xmlns:cx6="http://schemas.microsoft.com/office/drawing/2016/5/12/chartex" xmlns:cx7="http://schemas.microsoft.com/office/drawing/2016/5/13/chartex" xmlns:cx8="http://schemas.microsoft.com/office/drawing/2016/5/14/chartex" xmlns:mc="http://schemas.openxmlformats.org/markup-compatibility/2006" xmlns:aink="http://schemas.microsoft.com/office/drawing/2016/ink" xmlns:am3d="http://schemas.microsoft.com/office/drawing/2017/model3d" xmlns:o="urn:schemas-microsoft-com:office:office" xmlns:oel="http://schemas.microsoft.com/office/2019/extlst" xmlns:r="http://schemas.openxmlformats.org/officeDocument/2006/relationships" xmlns:m="http://schemas.openxmlformats.org/officeDocument/2006/math" xmlns:v="urn:schemas-microsoft-com:vml" xmlns:wp14="http://schemas.microsoft.com/office/word/2010/wordprocessingDrawing" xmlns:wp="http://schemas.openxmlformats.org/drawingml/2006/wordprocessingDrawing" xmlns:w10="urn:schemas-microsoft-com:office:word" xmlns:w="http://schemas.openxmlformats.org/wordprocessingml/2006/main" xmlns:w14="http://schemas.microsoft.com/office/word/2010/wordml" xmlns:w15="http://schemas.microsoft.com/office/word/2012/wordml" xmlns:w16cex="http://schemas.microsoft.com/office/word/2018/wordml/cex" xmlns:w16cid="http://schemas.microsoft.com/office/word/2016/wordml/cid" xmlns:w16="http://schemas.microsoft.com/office/word/2018/wordml" xmlns:w16du="http://schemas.microsoft.com/office/word/2023/wordml/word16du" xmlns:w16sdtdh="http://schemas.microsoft.com/office/word/2020/wordml/sdtdatahash" xmlns:w16sdtfl="http://schemas.microsoft.com/office/word/2024/wordml/sdtformatlock" xmlns:w16se="http://schemas.microsoft.com/office/word/2015/wordml/symex" xmlns:wpg="http://schemas.microsoft.com/office/word/2010/wordprocessingGroup" xmlns:wpi="http://schemas.microsoft.com/office/word/2010/wordprocessingInk" xmlns:wne="http://schemas.microsoft.com/office/word/2006/wordml" xmlns:wps="http://schemas.microsoft.com/office/word/2010/wordprocessingShape" mc:Ignorable="w14 w15 w16se w16cid w16 w16cex w16sdtdh w16sdtfl w16du wp14">
+<w:numbering xmlns:wpc="http://schemas.microsoft.com/office/word/2010/wordprocessingCanvas" xmlns:cx="http://schemas.microsoft.com/office/drawing/2014/chartex" xmlns:cx1="http://schemas.microsoft.com/office/drawing/2015/9/8/chartex" xmlns:cx2="http://schemas.microsoft.com/office/drawing/2015/10/21/chartex" xmlns:cx3="http://schemas.microsoft.com/office/drawing/2016/5/9/chartex" xmlns:cx4="http://schemas.microsoft.com/office/drawing/2016/5/10/chartex" xmlns:cx5="http://schemas.microsoft.com/office/drawing/2016/5/11/chartex" xmlns:cx6="http://schemas.microsoft.com/office/drawing/2016/5/12/chartex" xmlns:cx7="http://schemas.microsoft.com/office/drawing/2016/5/13/chartex" xmlns:cx8="http://schemas.microsoft.com/office/drawing/2016/5/14/chartex" xmlns:mc="http://schemas.openxmlformats.org/markup-compatibility/2006" xmlns:aink="http://schemas.microsoft.com/office/drawing/2016/ink" xmlns:am3d="http://schemas.microsoft.com/office/drawing/2017/model3d" xmlns:o="urn:schemas-microsoft-com:office:office" xmlns:oel="http://schemas.microsoft.com/office/2019/extlst" xmlns:r="http://schemas.openxmlformats.org/officeDocument/2006/relationships" xmlns:m="http://schemas.openxmlformats.org/officeDocument/2006/math" xmlns:v="urn:schemas-microsoft-com:vml" xmlns:wp14="http://schemas.microsoft.com/office/word/2010/wordprocessingDrawing" xmlns:wp="http://schemas.openxmlformats.org/drawingml/2006/wordprocessingDrawing" xmlns:w10="urn:schemas-microsoft-com:office:word" xmlns:w="http://schemas.openxmlformats.org/wordprocessingml/2006/main" xmlns:w14="http://schemas.microsoft.com/office/word/2010/wordml" xmlns:w15="http://schemas.microsoft.com/office/word/2012/wordml" xmlns:w16cex="http://schemas.microsoft.com/office/word/2018/wordml/cex" xmlns:w16cid="http://schemas.microsoft.com/office/word/2016/wordml/cid" xmlns:w16="http://schemas.microsoft.com/office/word/2018/wordml" xmlns:w16sdtdh="http://schemas.microsoft.com/office/word/2020/wordml/sdtdatahash" xmlns:w16se="http://schemas.microsoft.com/office/word/2015/wordml/symex" xmlns:wpg="http://schemas.microsoft.com/office/word/2010/wordprocessingGroup" xmlns:wpi="http://schemas.microsoft.com/office/word/2010/wordprocessingInk" xmlns:wne="http://schemas.microsoft.com/office/word/2006/wordml" xmlns:wps="http://schemas.microsoft.com/office/word/2010/wordprocessingShape" mc:Ignorable="w14 w15 w16se w16cid w16 w16cex w16sdtdh wp14">
   <w:abstractNum w:abstractNumId="0" w15:restartNumberingAfterBreak="0">
     <w:nsid w:val="0A815801"/>
     <w:multiLevelType w:val="hybridMultilevel"/>
@@ -4278,7 +4439,7 @@
 </file>
 
 <file path=word/people.xml><?xml version="1.0" encoding="utf-8"?>
-<w15:people xmlns:wpc="http://schemas.microsoft.com/office/word/2010/wordprocessingCanvas" xmlns:cx="http://schemas.microsoft.com/office/drawing/2014/chartex" xmlns:cx1="http://schemas.microsoft.com/office/drawing/2015/9/8/chartex" xmlns:cx2="http://schemas.microsoft.com/office/drawing/2015/10/21/chartex" xmlns:cx3="http://schemas.microsoft.com/office/drawing/2016/5/9/chartex" xmlns:cx4="http://schemas.microsoft.com/office/drawing/2016/5/10/chartex" xmlns:cx5="http://schemas.microsoft.com/office/drawing/2016/5/11/chartex" xmlns:cx6="http://schemas.microsoft.com/office/drawing/2016/5/12/chartex" xmlns:cx7="http://schemas.microsoft.com/office/drawing/2016/5/13/chartex" xmlns:cx8="http://schemas.microsoft.com/office/drawing/2016/5/14/chartex" xmlns:mc="http://schemas.openxmlformats.org/markup-compatibility/2006" xmlns:aink="http://schemas.microsoft.com/office/drawing/2016/ink" xmlns:am3d="http://schemas.microsoft.com/office/drawing/2017/model3d" xmlns:o="urn:schemas-microsoft-com:office:office" xmlns:oel="http://schemas.microsoft.com/office/2019/extlst" xmlns:r="http://schemas.openxmlformats.org/officeDocument/2006/relationships" xmlns:m="http://schemas.openxmlformats.org/officeDocument/2006/math" xmlns:v="urn:schemas-microsoft-com:vml" xmlns:wp14="http://schemas.microsoft.com/office/word/2010/wordprocessingDrawing" xmlns:wp="http://schemas.openxmlformats.org/drawingml/2006/wordprocessingDrawing" xmlns:w10="urn:schemas-microsoft-com:office:word" xmlns:w="http://schemas.openxmlformats.org/wordprocessingml/2006/main" xmlns:w14="http://schemas.microsoft.com/office/word/2010/wordml" xmlns:w15="http://schemas.microsoft.com/office/word/2012/wordml" xmlns:w16cex="http://schemas.microsoft.com/office/word/2018/wordml/cex" xmlns:w16cid="http://schemas.microsoft.com/office/word/2016/wordml/cid" xmlns:w16="http://schemas.microsoft.com/office/word/2018/wordml" xmlns:w16du="http://schemas.microsoft.com/office/word/2023/wordml/word16du" xmlns:w16sdtdh="http://schemas.microsoft.com/office/word/2020/wordml/sdtdatahash" xmlns:w16sdtfl="http://schemas.microsoft.com/office/word/2024/wordml/sdtformatlock" xmlns:w16se="http://schemas.microsoft.com/office/word/2015/wordml/symex" xmlns:wpg="http://schemas.microsoft.com/office/word/2010/wordprocessingGroup" xmlns:wpi="http://schemas.microsoft.com/office/word/2010/wordprocessingInk" xmlns:wne="http://schemas.microsoft.com/office/word/2006/wordml" xmlns:wps="http://schemas.microsoft.com/office/word/2010/wordprocessingShape" mc:Ignorable="w14 w15 w16se w16cid w16 w16cex w16sdtdh w16sdtfl w16du wp14">
+<w15:people xmlns:wpc="http://schemas.microsoft.com/office/word/2010/wordprocessingCanvas" xmlns:cx="http://schemas.microsoft.com/office/drawing/2014/chartex" xmlns:cx1="http://schemas.microsoft.com/office/drawing/2015/9/8/chartex" xmlns:cx2="http://schemas.microsoft.com/office/drawing/2015/10/21/chartex" xmlns:cx3="http://schemas.microsoft.com/office/drawing/2016/5/9/chartex" xmlns:cx4="http://schemas.microsoft.com/office/drawing/2016/5/10/chartex" xmlns:cx5="http://schemas.microsoft.com/office/drawing/2016/5/11/chartex" xmlns:cx6="http://schemas.microsoft.com/office/drawing/2016/5/12/chartex" xmlns:cx7="http://schemas.microsoft.com/office/drawing/2016/5/13/chartex" xmlns:cx8="http://schemas.microsoft.com/office/drawing/2016/5/14/chartex" xmlns:mc="http://schemas.openxmlformats.org/markup-compatibility/2006" xmlns:aink="http://schemas.microsoft.com/office/drawing/2016/ink" xmlns:am3d="http://schemas.microsoft.com/office/drawing/2017/model3d" xmlns:o="urn:schemas-microsoft-com:office:office" xmlns:oel="http://schemas.microsoft.com/office/2019/extlst" xmlns:r="http://schemas.openxmlformats.org/officeDocument/2006/relationships" xmlns:m="http://schemas.openxmlformats.org/officeDocument/2006/math" xmlns:v="urn:schemas-microsoft-com:vml" xmlns:wp14="http://schemas.microsoft.com/office/word/2010/wordprocessingDrawing" xmlns:wp="http://schemas.openxmlformats.org/drawingml/2006/wordprocessingDrawing" xmlns:w10="urn:schemas-microsoft-com:office:word" xmlns:w="http://schemas.openxmlformats.org/wordprocessingml/2006/main" xmlns:w14="http://schemas.microsoft.com/office/word/2010/wordml" xmlns:w15="http://schemas.microsoft.com/office/word/2012/wordml" xmlns:w16cex="http://schemas.microsoft.com/office/word/2018/wordml/cex" xmlns:w16cid="http://schemas.microsoft.com/office/word/2016/wordml/cid" xmlns:w16="http://schemas.microsoft.com/office/word/2018/wordml" xmlns:w16sdtdh="http://schemas.microsoft.com/office/word/2020/wordml/sdtdatahash" xmlns:w16se="http://schemas.microsoft.com/office/word/2015/wordml/symex" xmlns:wpg="http://schemas.microsoft.com/office/word/2010/wordprocessingGroup" xmlns:wpi="http://schemas.microsoft.com/office/word/2010/wordprocessingInk" xmlns:wne="http://schemas.microsoft.com/office/word/2006/wordml" xmlns:wps="http://schemas.microsoft.com/office/word/2010/wordprocessingShape" mc:Ignorable="w14 w15 w16se w16cid w16 w16cex w16sdtdh wp14">
   <w15:person w15:author="Helen Nguyen">
     <w15:presenceInfo w15:providerId="AD" w15:userId="S::nganguyen@usf.edu::1112739b-77dc-448a-8744-257d55cee90b"/>
   </w15:person>
@@ -4286,7 +4447,7 @@
 </file>
 
 <file path=word/styles.xml><?xml version="1.0" encoding="utf-8"?>
-<w:styles xmlns:mc="http://schemas.openxmlformats.org/markup-compatibility/2006" xmlns:r="http://schemas.openxmlformats.org/officeDocument/2006/relationships" xmlns:w="http://schemas.openxmlformats.org/wordprocessingml/2006/main" xmlns:w14="http://schemas.microsoft.com/office/word/2010/wordml" xmlns:w15="http://schemas.microsoft.com/office/word/2012/wordml" xmlns:w16cex="http://schemas.microsoft.com/office/word/2018/wordml/cex" xmlns:w16cid="http://schemas.microsoft.com/office/word/2016/wordml/cid" xmlns:w16="http://schemas.microsoft.com/office/word/2018/wordml" xmlns:w16du="http://schemas.microsoft.com/office/word/2023/wordml/word16du" xmlns:w16sdtdh="http://schemas.microsoft.com/office/word/2020/wordml/sdtdatahash" xmlns:w16sdtfl="http://schemas.microsoft.com/office/word/2024/wordml/sdtformatlock" xmlns:w16se="http://schemas.microsoft.com/office/word/2015/wordml/symex" mc:Ignorable="w14 w15 w16se w16cid w16 w16cex w16sdtdh w16sdtfl w16du">
+<w:styles xmlns:mc="http://schemas.openxmlformats.org/markup-compatibility/2006" xmlns:r="http://schemas.openxmlformats.org/officeDocument/2006/relationships" xmlns:w="http://schemas.openxmlformats.org/wordprocessingml/2006/main" xmlns:w14="http://schemas.microsoft.com/office/word/2010/wordml" xmlns:w15="http://schemas.microsoft.com/office/word/2012/wordml" xmlns:w16cex="http://schemas.microsoft.com/office/word/2018/wordml/cex" xmlns:w16cid="http://schemas.microsoft.com/office/word/2016/wordml/cid" xmlns:w16="http://schemas.microsoft.com/office/word/2018/wordml" xmlns:w16sdtdh="http://schemas.microsoft.com/office/word/2020/wordml/sdtdatahash" xmlns:w16se="http://schemas.microsoft.com/office/word/2015/wordml/symex" mc:Ignorable="w14 w15 w16se w16cid w16 w16cex w16sdtdh">
   <w:docDefaults>
     <w:rPrDefault>
       <w:rPr>

</xml_diff>

<commit_message>
Updated Script for Comparison Table
</commit_message>
<xml_diff>
--- a/ISM4545 - Midterm Project - Final Version.docx
+++ b/ISM4545 - Midterm Project - Final Version.docx
@@ -1,17 +1,19 @@
 
 <file path=word/document.xml><?xml version="1.0" encoding="utf-8"?>
-<w:document xmlns:wpc="http://schemas.microsoft.com/office/word/2010/wordprocessingCanvas" xmlns:cx="http://schemas.microsoft.com/office/drawing/2014/chartex" xmlns:cx1="http://schemas.microsoft.com/office/drawing/2015/9/8/chartex" xmlns:cx2="http://schemas.microsoft.com/office/drawing/2015/10/21/chartex" xmlns:cx3="http://schemas.microsoft.com/office/drawing/2016/5/9/chartex" xmlns:cx4="http://schemas.microsoft.com/office/drawing/2016/5/10/chartex" xmlns:cx5="http://schemas.microsoft.com/office/drawing/2016/5/11/chartex" xmlns:cx6="http://schemas.microsoft.com/office/drawing/2016/5/12/chartex" xmlns:cx7="http://schemas.microsoft.com/office/drawing/2016/5/13/chartex" xmlns:cx8="http://schemas.microsoft.com/office/drawing/2016/5/14/chartex" xmlns:mc="http://schemas.openxmlformats.org/markup-compatibility/2006" xmlns:aink="http://schemas.microsoft.com/office/drawing/2016/ink" xmlns:am3d="http://schemas.microsoft.com/office/drawing/2017/model3d" xmlns:o="urn:schemas-microsoft-com:office:office" xmlns:oel="http://schemas.microsoft.com/office/2019/extlst" xmlns:r="http://schemas.openxmlformats.org/officeDocument/2006/relationships" xmlns:m="http://schemas.openxmlformats.org/officeDocument/2006/math" xmlns:v="urn:schemas-microsoft-com:vml" xmlns:wp14="http://schemas.microsoft.com/office/word/2010/wordprocessingDrawing" xmlns:wp="http://schemas.openxmlformats.org/drawingml/2006/wordprocessingDrawing" xmlns:w10="urn:schemas-microsoft-com:office:word" xmlns:w="http://schemas.openxmlformats.org/wordprocessingml/2006/main" xmlns:w14="http://schemas.microsoft.com/office/word/2010/wordml" xmlns:w15="http://schemas.microsoft.com/office/word/2012/wordml" xmlns:w16cex="http://schemas.microsoft.com/office/word/2018/wordml/cex" xmlns:w16cid="http://schemas.microsoft.com/office/word/2016/wordml/cid" xmlns:w16="http://schemas.microsoft.com/office/word/2018/wordml" xmlns:w16sdtdh="http://schemas.microsoft.com/office/word/2020/wordml/sdtdatahash" xmlns:w16se="http://schemas.microsoft.com/office/word/2015/wordml/symex" xmlns:wpg="http://schemas.microsoft.com/office/word/2010/wordprocessingGroup" xmlns:wpi="http://schemas.microsoft.com/office/word/2010/wordprocessingInk" xmlns:wne="http://schemas.microsoft.com/office/word/2006/wordml" xmlns:wps="http://schemas.microsoft.com/office/word/2010/wordprocessingShape" mc:Ignorable="w14 w15 w16se w16cid w16 w16cex w16sdtdh wp14">
+<w:document xmlns:wpc="http://schemas.microsoft.com/office/word/2010/wordprocessingCanvas" xmlns:cx="http://schemas.microsoft.com/office/drawing/2014/chartex" xmlns:cx1="http://schemas.microsoft.com/office/drawing/2015/9/8/chartex" xmlns:cx2="http://schemas.microsoft.com/office/drawing/2015/10/21/chartex" xmlns:cx3="http://schemas.microsoft.com/office/drawing/2016/5/9/chartex" xmlns:cx4="http://schemas.microsoft.com/office/drawing/2016/5/10/chartex" xmlns:cx5="http://schemas.microsoft.com/office/drawing/2016/5/11/chartex" xmlns:cx6="http://schemas.microsoft.com/office/drawing/2016/5/12/chartex" xmlns:cx7="http://schemas.microsoft.com/office/drawing/2016/5/13/chartex" xmlns:cx8="http://schemas.microsoft.com/office/drawing/2016/5/14/chartex" xmlns:mc="http://schemas.openxmlformats.org/markup-compatibility/2006" xmlns:aink="http://schemas.microsoft.com/office/drawing/2016/ink" xmlns:am3d="http://schemas.microsoft.com/office/drawing/2017/model3d" xmlns:o="urn:schemas-microsoft-com:office:office" xmlns:oel="http://schemas.microsoft.com/office/2019/extlst" xmlns:r="http://schemas.openxmlformats.org/officeDocument/2006/relationships" xmlns:m="http://schemas.openxmlformats.org/officeDocument/2006/math" xmlns:v="urn:schemas-microsoft-com:vml" xmlns:wp14="http://schemas.microsoft.com/office/word/2010/wordprocessingDrawing" xmlns:wp="http://schemas.openxmlformats.org/drawingml/2006/wordprocessingDrawing" xmlns:w10="urn:schemas-microsoft-com:office:word" xmlns:w="http://schemas.openxmlformats.org/wordprocessingml/2006/main" xmlns:w14="http://schemas.microsoft.com/office/word/2010/wordml" xmlns:w15="http://schemas.microsoft.com/office/word/2012/wordml" xmlns:w16cex="http://schemas.microsoft.com/office/word/2018/wordml/cex" xmlns:w16cid="http://schemas.microsoft.com/office/word/2016/wordml/cid" xmlns:w16="http://schemas.microsoft.com/office/word/2018/wordml" xmlns:w16du="http://schemas.microsoft.com/office/word/2023/wordml/word16du" xmlns:w16sdtdh="http://schemas.microsoft.com/office/word/2020/wordml/sdtdatahash" xmlns:w16sdtfl="http://schemas.microsoft.com/office/word/2024/wordml/sdtformatlock" xmlns:w16se="http://schemas.microsoft.com/office/word/2015/wordml/symex" xmlns:wpg="http://schemas.microsoft.com/office/word/2010/wordprocessingGroup" xmlns:wpi="http://schemas.microsoft.com/office/word/2010/wordprocessingInk" xmlns:wne="http://schemas.microsoft.com/office/word/2006/wordml" xmlns:wps="http://schemas.microsoft.com/office/word/2010/wordprocessingShape" mc:Ignorable="w14 w15 w16se w16cid w16 w16cex w16sdtdh w16sdtfl w16du wp14">
   <w:body>
     <w:p>
       <w:pPr>
         <w:pStyle w:val="Heading1"/>
         <w:rPr>
+          <w:rFonts w:asciiTheme="minorHAnsi" w:hAnsiTheme="minorHAnsi"/>
           <w:sz w:val="24"/>
           <w:szCs w:val="24"/>
         </w:rPr>
       </w:pPr>
       <w:r>
         <w:rPr>
+          <w:rFonts w:asciiTheme="minorHAnsi" w:hAnsiTheme="minorHAnsi"/>
           <w:sz w:val="24"/>
           <w:szCs w:val="24"/>
         </w:rPr>
@@ -40,6 +42,7 @@
       <w:pPr>
         <w:pStyle w:val="Heading1"/>
         <w:rPr>
+          <w:rFonts w:asciiTheme="minorHAnsi" w:hAnsiTheme="minorHAnsi"/>
           <w:sz w:val="24"/>
           <w:szCs w:val="24"/>
         </w:rPr>
@@ -47,29 +50,17 @@
       <w:commentRangeStart w:id="0"/>
       <w:r>
         <w:rPr>
+          <w:rFonts w:asciiTheme="minorHAnsi" w:hAnsiTheme="minorHAnsi"/>
           <w:sz w:val="24"/>
           <w:szCs w:val="24"/>
         </w:rPr>
-        <w:t>System Overview (2 min) — What the system is, who created it, who uses it in production,</w:t>
-      </w:r>
-      <w:r>
-        <w:rPr>
-          <w:sz w:val="24"/>
-          <w:szCs w:val="24"/>
-        </w:rPr>
-        <w:t xml:space="preserve"> </w:t>
-      </w:r>
-      <w:r>
-        <w:rPr>
-          <w:sz w:val="24"/>
-          <w:szCs w:val="24"/>
-        </w:rPr>
-        <w:t>and the core value proposition. Set the stage for the technical deep dive.</w:t>
+        <w:t>System Overview (2 min) — What the system is, who created it, who uses it in production, and the core value proposition. Set the stage for the technical deep dive.</w:t>
       </w:r>
       <w:commentRangeEnd w:id="0"/>
       <w:r>
         <w:rPr>
           <w:rStyle w:val="CommentReference"/>
+          <w:rFonts w:asciiTheme="minorHAnsi" w:hAnsiTheme="minorHAnsi"/>
           <w:sz w:val="24"/>
           <w:szCs w:val="24"/>
         </w:rPr>
@@ -327,23 +318,7 @@
           <w:rFonts w:eastAsia="Times New Roman" w:cs="Times New Roman"/>
           <w:lang w:eastAsia="en-US"/>
         </w:rPr>
-        <w:t xml:space="preserve"> can use it directly as a key-value database for more </w:t>
-      </w:r>
-      <w:proofErr w:type="gramStart"/>
-      <w:r>
-        <w:rPr>
-          <w:rFonts w:eastAsia="Times New Roman" w:cs="Times New Roman"/>
-          <w:lang w:eastAsia="en-US"/>
-        </w:rPr>
-        <w:t>control, or</w:t>
-      </w:r>
-      <w:proofErr w:type="gramEnd"/>
-      <w:r>
-        <w:rPr>
-          <w:rFonts w:eastAsia="Times New Roman" w:cs="Times New Roman"/>
-          <w:lang w:eastAsia="en-US"/>
-        </w:rPr>
-        <w:t xml:space="preserve"> use a layer that makes it behave more like another type of database, such as a document database. </w:t>
+        <w:t xml:space="preserve"> can use it directly as a key-value database for more control, or use a layer that makes it behave more like another type of database, such as a document database. </w:t>
       </w:r>
     </w:p>
     <w:p>
@@ -363,31 +338,8 @@
           <w:rFonts w:eastAsia="Times New Roman" w:cs="Times New Roman"/>
           <w:lang w:eastAsia="en-US"/>
         </w:rPr>
-        <w:t xml:space="preserve">Its architecture reinforces that value by dividing the system into specialized roles, where each role handles a different job. </w:t>
-      </w:r>
-      <w:proofErr w:type="gramStart"/>
-      <w:r>
-        <w:rPr>
-          <w:rFonts w:eastAsia="Times New Roman" w:cs="Times New Roman"/>
-          <w:lang w:eastAsia="en-US"/>
-        </w:rPr>
-        <w:t>This matters</w:t>
-      </w:r>
-      <w:proofErr w:type="gramEnd"/>
-      <w:r>
-        <w:rPr>
-          <w:rFonts w:eastAsia="Times New Roman" w:cs="Times New Roman"/>
-          <w:lang w:eastAsia="en-US"/>
-        </w:rPr>
-        <w:t xml:space="preserve"> allows different </w:t>
-      </w:r>
-      <w:r>
-        <w:rPr>
-          <w:rFonts w:eastAsia="Times New Roman" w:cs="Times New Roman"/>
-          <w:lang w:eastAsia="en-US"/>
-        </w:rPr>
         <w:lastRenderedPageBreak/>
-        <w:t>types of work to scale separately</w:t>
+        <w:t>Its architecture reinforces that value by dividing the system into specialized roles, where each role handles a different job. This matters allows different types of work to scale separately</w:t>
       </w:r>
       <w:r>
         <w:rPr>
@@ -416,27 +368,19 @@
           <w:lang w:eastAsia="en-US"/>
         </w:rPr>
       </w:pPr>
-      <w:proofErr w:type="gramStart"/>
       <w:r>
         <w:rPr>
           <w:rFonts w:eastAsia="Times New Roman" w:cs="Times New Roman"/>
           <w:lang w:eastAsia="en-US"/>
         </w:rPr>
-        <w:t>So</w:t>
-      </w:r>
-      <w:proofErr w:type="gramEnd"/>
-      <w:r>
-        <w:rPr>
-          <w:rFonts w:eastAsia="Times New Roman" w:cs="Times New Roman"/>
-          <w:lang w:eastAsia="en-US"/>
-        </w:rPr>
-        <w:t xml:space="preserve"> the deeper point is that FoundationDB is designed so correctness, performance, and scalability are built into the system from the start.</w:t>
+        <w:t>So the deeper point is that FoundationDB is designed so correctness, performance, and scalability are built into the system from the start.</w:t>
       </w:r>
     </w:p>
     <w:p>
       <w:pPr>
         <w:pStyle w:val="Heading1"/>
         <w:rPr>
+          <w:rFonts w:asciiTheme="minorHAnsi" w:hAnsiTheme="minorHAnsi"/>
           <w:sz w:val="24"/>
           <w:szCs w:val="24"/>
         </w:rPr>
@@ -444,43 +388,17 @@
       <w:commentRangeStart w:id="1"/>
       <w:r>
         <w:rPr>
+          <w:rFonts w:asciiTheme="minorHAnsi" w:hAnsiTheme="minorHAnsi"/>
           <w:sz w:val="24"/>
           <w:szCs w:val="24"/>
         </w:rPr>
-        <w:t>Technical Deep Dive (3–4 min) — Architecture, CAP positioning, consistency model, and</w:t>
-      </w:r>
-      <w:r>
-        <w:rPr>
-          <w:sz w:val="24"/>
-          <w:szCs w:val="24"/>
-        </w:rPr>
-        <w:t xml:space="preserve"> </w:t>
-      </w:r>
-      <w:r>
-        <w:rPr>
-          <w:sz w:val="24"/>
-          <w:szCs w:val="24"/>
-        </w:rPr>
-        <w:t>scaling approach. This is the core of your presentation. Must include at least one</w:t>
-      </w:r>
-      <w:r>
-        <w:rPr>
-          <w:sz w:val="24"/>
-          <w:szCs w:val="24"/>
-        </w:rPr>
-        <w:t xml:space="preserve"> </w:t>
-      </w:r>
-      <w:r>
-        <w:rPr>
-          <w:sz w:val="24"/>
-          <w:szCs w:val="24"/>
-        </w:rPr>
-        <w:t>architecture diagram.</w:t>
+        <w:t>Technical Deep Dive (3–4 min) — Architecture, CAP positioning, consistency model, and scaling approach. This is the core of your presentation. Must include at least one architecture diagram.</w:t>
       </w:r>
       <w:commentRangeEnd w:id="1"/>
       <w:r>
         <w:rPr>
           <w:rStyle w:val="CommentReference"/>
+          <w:rFonts w:asciiTheme="minorHAnsi" w:hAnsiTheme="minorHAnsi"/>
           <w:sz w:val="24"/>
           <w:szCs w:val="24"/>
         </w:rPr>
@@ -636,15 +554,7 @@
           <w:sz w:val="21"/>
           <w:szCs w:val="21"/>
         </w:rPr>
-        <w:t xml:space="preserve"> The system relies on </w:t>
-      </w:r>
-      <w:proofErr w:type="gramStart"/>
-      <w:r>
-        <w:rPr>
-          <w:sz w:val="21"/>
-          <w:szCs w:val="21"/>
-        </w:rPr>
-        <w:t xml:space="preserve">a </w:t>
+        <w:t xml:space="preserve"> The system relies on a </w:t>
       </w:r>
       <w:r>
         <w:rPr>
@@ -653,17 +563,7 @@
           <w:sz w:val="21"/>
           <w:szCs w:val="21"/>
         </w:rPr>
-        <w:t>majority of</w:t>
-      </w:r>
-      <w:proofErr w:type="gramEnd"/>
-      <w:r>
-        <w:rPr>
-          <w:b/>
-          <w:bCs/>
-          <w:sz w:val="21"/>
-          <w:szCs w:val="21"/>
-        </w:rPr>
-        <w:t xml:space="preserve"> Coordinators</w:t>
+        <w:t>majority of Coordinators</w:t>
       </w:r>
       <w:r>
         <w:rPr>
@@ -796,7 +696,6 @@
         </w:rPr>
         <w:t xml:space="preserve"> Data is </w:t>
       </w:r>
-      <w:proofErr w:type="gramStart"/>
       <w:r>
         <w:rPr>
           <w:b/>
@@ -806,7 +705,6 @@
         </w:rPr>
         <w:t>range-partitioned</w:t>
       </w:r>
-      <w:proofErr w:type="gramEnd"/>
       <w:r>
         <w:rPr>
           <w:sz w:val="21"/>
@@ -886,15 +784,7 @@
         </w:drawing>
       </w:r>
       <w:r>
-        <w:t xml:space="preserve"> (</w:t>
-      </w:r>
-      <w:proofErr w:type="gramStart"/>
-      <w:r>
-        <w:t>subject</w:t>
-      </w:r>
-      <w:proofErr w:type="gramEnd"/>
-      <w:r>
-        <w:t xml:space="preserve"> to change)</w:t>
+        <w:t xml:space="preserve"> (subject to change)</w:t>
       </w:r>
     </w:p>
     <w:p/>
@@ -911,7 +801,7 @@
       </w:r>
       <w:r>
         <w:rPr>
-          <w:rFonts w:ascii="Lato" w:eastAsia="Lato" w:hAnsi="Lato" w:cs="Lato"/>
+          <w:rFonts w:eastAsia="Lato" w:cs="Lato"/>
           <w:color w:val="000000" w:themeColor="text1"/>
           <w:sz w:val="22"/>
           <w:szCs w:val="22"/>
@@ -930,7 +820,7 @@
         <w:spacing w:after="0"/>
         <w:ind w:firstLine="720"/>
         <w:rPr>
-          <w:rFonts w:ascii="Lato" w:eastAsia="Lato" w:hAnsi="Lato" w:cs="Lato"/>
+          <w:rFonts w:eastAsia="Lato" w:cs="Lato"/>
           <w:color w:val="000000" w:themeColor="text1"/>
           <w:sz w:val="22"/>
           <w:szCs w:val="22"/>
@@ -938,7 +828,7 @@
       </w:pPr>
       <w:r>
         <w:rPr>
-          <w:rFonts w:ascii="Lato" w:eastAsia="Lato" w:hAnsi="Lato" w:cs="Lato"/>
+          <w:rFonts w:eastAsia="Lato" w:cs="Lato"/>
           <w:color w:val="000000" w:themeColor="text1"/>
           <w:sz w:val="22"/>
           <w:szCs w:val="22"/>
@@ -950,101 +840,102 @@
       </w:r>
       <w:r>
         <w:rPr>
-          <w:rFonts w:ascii="Lato" w:eastAsia="Lato" w:hAnsi="Lato" w:cs="Lato"/>
+          <w:rFonts w:eastAsia="Lato" w:cs="Lato"/>
           <w:color w:val="000000" w:themeColor="text1"/>
           <w:sz w:val="22"/>
           <w:szCs w:val="22"/>
         </w:rPr>
-        <w:t xml:space="preserve">In case of a network partition, only </w:t>
-      </w:r>
-      <w:proofErr w:type="gramStart"/>
-      <w:r>
-        <w:rPr>
-          <w:rFonts w:ascii="Lato" w:eastAsia="Lato" w:hAnsi="Lato" w:cs="Lato"/>
+        <w:t>In case of a network partition, only the majority of nodes can process writes, while minority nodes become unavailable to prevent inconsistencies.</w:t>
+      </w:r>
+      <w:r>
+        <w:rPr>
+          <w:rFonts w:eastAsia="Lato" w:cs="Lato"/>
           <w:color w:val="000000" w:themeColor="text1"/>
           <w:sz w:val="22"/>
           <w:szCs w:val="22"/>
         </w:rPr>
-        <w:t>the majority of</w:t>
-      </w:r>
-      <w:proofErr w:type="gramEnd"/>
-      <w:r>
-        <w:rPr>
-          <w:rFonts w:ascii="Lato" w:eastAsia="Lato" w:hAnsi="Lato" w:cs="Lato"/>
+        <w:t xml:space="preserve"> </w:t>
+      </w:r>
+      <w:r>
+        <w:rPr>
+          <w:rFonts w:eastAsia="Lato" w:cs="Lato"/>
           <w:color w:val="000000" w:themeColor="text1"/>
           <w:sz w:val="22"/>
           <w:szCs w:val="22"/>
         </w:rPr>
-        <w:t xml:space="preserve"> nodes can process writes, while minority nodes become unavailable to prevent inconsistencies.</w:t>
-      </w:r>
-      <w:r>
-        <w:rPr>
-          <w:rFonts w:ascii="Lato" w:eastAsia="Lato" w:hAnsi="Lato" w:cs="Lato"/>
+        <w:t>This is like PostgreSQL, which also focuses on strong consistency, but PostgreSQL doesn’t scale horizontally as well.</w:t>
+      </w:r>
+      <w:r>
+        <w:br/>
+      </w:r>
+      <w:r>
+        <w:tab/>
+      </w:r>
+      <w:r>
+        <w:rPr>
+          <w:rFonts w:eastAsia="Lato" w:cs="Lato"/>
           <w:color w:val="000000" w:themeColor="text1"/>
           <w:sz w:val="22"/>
           <w:szCs w:val="22"/>
         </w:rPr>
-        <w:t xml:space="preserve"> </w:t>
-      </w:r>
-      <w:r>
-        <w:rPr>
-          <w:rFonts w:ascii="Lato" w:eastAsia="Lato" w:hAnsi="Lato" w:cs="Lato"/>
+        <w:t>On the other hand, Cassandra is an AP system, prioritizing availability and allowing eventual consistency. So overall, FoundationDB sits in the middle - it provides strong consistency like PostgreSQL, but with the scalability of distributed systems.</w:t>
+      </w:r>
+    </w:p>
+    <w:p>
+      <w:pPr>
+        <w:spacing w:after="0"/>
+      </w:pPr>
+    </w:p>
+    <w:p>
+      <w:pPr>
+        <w:spacing w:after="0"/>
+        <w:ind w:firstLine="720"/>
+      </w:pPr>
+      <w:r>
+        <w:rPr>
+          <w:rFonts w:eastAsia="Lato" w:cs="Lato"/>
           <w:color w:val="000000" w:themeColor="text1"/>
           <w:sz w:val="22"/>
           <w:szCs w:val="22"/>
         </w:rPr>
-        <w:t>This is like PostgreSQL, which also focuses on strong consistency, but PostgreSQL doesn’t scale horizontally as well.</w:t>
+        <w:t>Unlike PostgreSQL, FoundationDB does not support SQL natively. Instead, it uses a key-value model, and SQL functionality must be added through external layers like the Record Layer.</w:t>
       </w:r>
       <w:r>
         <w:br/>
       </w:r>
       <w:r>
-        <w:tab/>
-      </w:r>
-      <w:r>
-        <w:rPr>
-          <w:rFonts w:ascii="Lato" w:eastAsia="Lato" w:hAnsi="Lato" w:cs="Lato"/>
+        <w:rPr>
+          <w:rFonts w:eastAsia="Lato" w:cs="Lato"/>
           <w:color w:val="000000" w:themeColor="text1"/>
           <w:sz w:val="22"/>
           <w:szCs w:val="22"/>
         </w:rPr>
-        <w:t>On the other hand, Cassandra is an AP system, prioritizing availability and allowing eventual consistency. So overall, FoundationDB sits in the middle - it provides strong consistency like PostgreSQL, but with the scalability of distributed systems.</w:t>
-      </w:r>
-    </w:p>
-    <w:p>
-      <w:pPr>
-        <w:spacing w:after="0"/>
-      </w:pPr>
-    </w:p>
-    <w:p>
-      <w:pPr>
-        <w:spacing w:after="0"/>
-        <w:ind w:firstLine="720"/>
-      </w:pPr>
-      <w:r>
-        <w:rPr>
-          <w:rFonts w:ascii="Lato" w:eastAsia="Lato" w:hAnsi="Lato" w:cs="Lato"/>
+        <w:t>This means features like joins, window functions, and stored procedures are not directly available.</w:t>
+      </w:r>
+      <w:r>
+        <w:rPr>
+          <w:rFonts w:eastAsia="Lato" w:cs="Lato"/>
           <w:color w:val="000000" w:themeColor="text1"/>
           <w:sz w:val="22"/>
           <w:szCs w:val="22"/>
         </w:rPr>
-        <w:t>Unlike PostgreSQL, FoundationDB does not support SQL natively. Instead, it uses a key-value model, and SQL functionality must be added through external layers like the Record Layer.</w:t>
-      </w:r>
-      <w:r>
-        <w:br/>
-      </w:r>
-      <w:r>
-        <w:rPr>
-          <w:rFonts w:ascii="Lato" w:eastAsia="Lato" w:hAnsi="Lato" w:cs="Lato"/>
+        <w:t xml:space="preserve"> </w:t>
+      </w:r>
+      <w:r>
+        <w:tab/>
+      </w:r>
+      <w:r>
+        <w:rPr>
+          <w:rFonts w:eastAsia="Lato" w:cs="Lato"/>
           <w:color w:val="000000" w:themeColor="text1"/>
           <w:sz w:val="22"/>
           <w:szCs w:val="22"/>
         </w:rPr>
-        <w:t>This means features like joins, window functions, and stored procedures are not directly available.</w:t>
-      </w:r>
-      <w:r>
-        <w:rPr>
-          <w:rFonts w:ascii="Lato" w:eastAsia="Lato" w:hAnsi="Lato" w:cs="Lato"/>
+        <w:t>Because of this, developers must design data models based on access patterns, similar to Cassandra.</w:t>
+      </w:r>
+      <w:r>
+        <w:rPr>
+          <w:rFonts w:eastAsia="Lato" w:cs="Lato"/>
           <w:color w:val="000000" w:themeColor="text1"/>
           <w:sz w:val="22"/>
           <w:szCs w:val="22"/>
@@ -1052,53 +943,12 @@
         <w:t xml:space="preserve"> </w:t>
       </w:r>
       <w:r>
-        <w:tab/>
-      </w:r>
-      <w:r>
-        <w:rPr>
-          <w:rFonts w:ascii="Lato" w:eastAsia="Lato" w:hAnsi="Lato" w:cs="Lato"/>
+        <w:rPr>
+          <w:rFonts w:eastAsia="Lato" w:cs="Lato"/>
           <w:color w:val="000000" w:themeColor="text1"/>
           <w:sz w:val="22"/>
           <w:szCs w:val="22"/>
         </w:rPr>
-        <w:t xml:space="preserve">Because of this, developers must design data models based on access patterns, </w:t>
-      </w:r>
-      <w:proofErr w:type="gramStart"/>
-      <w:r>
-        <w:rPr>
-          <w:rFonts w:ascii="Lato" w:eastAsia="Lato" w:hAnsi="Lato" w:cs="Lato"/>
-          <w:color w:val="000000" w:themeColor="text1"/>
-          <w:sz w:val="22"/>
-          <w:szCs w:val="22"/>
-        </w:rPr>
-        <w:t>similar to</w:t>
-      </w:r>
-      <w:proofErr w:type="gramEnd"/>
-      <w:r>
-        <w:rPr>
-          <w:rFonts w:ascii="Lato" w:eastAsia="Lato" w:hAnsi="Lato" w:cs="Lato"/>
-          <w:color w:val="000000" w:themeColor="text1"/>
-          <w:sz w:val="22"/>
-          <w:szCs w:val="22"/>
-        </w:rPr>
-        <w:t xml:space="preserve"> Cassandra.</w:t>
-      </w:r>
-      <w:r>
-        <w:rPr>
-          <w:rFonts w:ascii="Lato" w:eastAsia="Lato" w:hAnsi="Lato" w:cs="Lato"/>
-          <w:color w:val="000000" w:themeColor="text1"/>
-          <w:sz w:val="22"/>
-          <w:szCs w:val="22"/>
-        </w:rPr>
-        <w:t xml:space="preserve"> </w:t>
-      </w:r>
-      <w:r>
-        <w:rPr>
-          <w:rFonts w:ascii="Lato" w:eastAsia="Lato" w:hAnsi="Lato" w:cs="Lato"/>
-          <w:color w:val="000000" w:themeColor="text1"/>
-          <w:sz w:val="22"/>
-          <w:szCs w:val="22"/>
-        </w:rPr>
         <w:t>While this reduces flexibility for ad-hoc queries, it improves performance and scalability in distributed environments.</w:t>
       </w:r>
     </w:p>
@@ -1106,7 +956,7 @@
     <w:p>
       <w:r>
         <w:rPr>
-          <w:rFonts w:ascii="Aptos" w:eastAsia="Aptos" w:hAnsi="Aptos" w:cs="Aptos"/>
+          <w:rFonts w:eastAsia="Aptos" w:cs="Aptos"/>
         </w:rPr>
         <w:t>Slide: Scaling Model</w:t>
       </w:r>
@@ -1120,12 +970,12 @@
         </w:numPr>
         <w:spacing w:after="0"/>
         <w:rPr>
-          <w:rFonts w:ascii="Aptos" w:eastAsia="Aptos" w:hAnsi="Aptos" w:cs="Aptos"/>
-        </w:rPr>
-      </w:pPr>
-      <w:r>
-        <w:rPr>
-          <w:rFonts w:ascii="Aptos" w:eastAsia="Aptos" w:hAnsi="Aptos" w:cs="Aptos"/>
+          <w:rFonts w:eastAsia="Aptos" w:cs="Aptos"/>
+        </w:rPr>
+      </w:pPr>
+      <w:r>
+        <w:rPr>
+          <w:rFonts w:eastAsia="Aptos" w:cs="Aptos"/>
         </w:rPr>
         <w:lastRenderedPageBreak/>
         <w:t>Automatic range-based sharding</w:t>
@@ -1140,23 +990,15 @@
         </w:numPr>
         <w:spacing w:after="0"/>
         <w:rPr>
-          <w:rFonts w:ascii="Aptos" w:eastAsia="Aptos" w:hAnsi="Aptos" w:cs="Aptos"/>
-        </w:rPr>
-      </w:pPr>
-      <w:r>
-        <w:rPr>
-          <w:rFonts w:ascii="Aptos" w:eastAsia="Aptos" w:hAnsi="Aptos" w:cs="Aptos"/>
-        </w:rPr>
-        <w:t xml:space="preserve">Key ranges distributed across </w:t>
-      </w:r>
-      <w:proofErr w:type="gramStart"/>
-      <w:r>
-        <w:rPr>
-          <w:rFonts w:ascii="Aptos" w:eastAsia="Aptos" w:hAnsi="Aptos" w:cs="Aptos"/>
-        </w:rPr>
-        <w:t>servers</w:t>
-      </w:r>
-      <w:proofErr w:type="gramEnd"/>
+          <w:rFonts w:eastAsia="Aptos" w:cs="Aptos"/>
+        </w:rPr>
+      </w:pPr>
+      <w:r>
+        <w:rPr>
+          <w:rFonts w:eastAsia="Aptos" w:cs="Aptos"/>
+        </w:rPr>
+        <w:t>Key ranges distributed across servers</w:t>
+      </w:r>
     </w:p>
     <w:p>
       <w:pPr>
@@ -1167,23 +1009,15 @@
         </w:numPr>
         <w:spacing w:after="0"/>
         <w:rPr>
-          <w:rFonts w:ascii="Aptos" w:eastAsia="Aptos" w:hAnsi="Aptos" w:cs="Aptos"/>
-        </w:rPr>
-      </w:pPr>
-      <w:r>
-        <w:rPr>
-          <w:rFonts w:ascii="Aptos" w:eastAsia="Aptos" w:hAnsi="Aptos" w:cs="Aptos"/>
-        </w:rPr>
-        <w:t>Rebalancing is automatic when nodes added/</w:t>
-      </w:r>
-      <w:proofErr w:type="gramStart"/>
-      <w:r>
-        <w:rPr>
-          <w:rFonts w:ascii="Aptos" w:eastAsia="Aptos" w:hAnsi="Aptos" w:cs="Aptos"/>
-        </w:rPr>
-        <w:t>removed</w:t>
-      </w:r>
-      <w:proofErr w:type="gramEnd"/>
+          <w:rFonts w:eastAsia="Aptos" w:cs="Aptos"/>
+        </w:rPr>
+      </w:pPr>
+      <w:r>
+        <w:rPr>
+          <w:rFonts w:eastAsia="Aptos" w:cs="Aptos"/>
+        </w:rPr>
+        <w:t>Rebalancing is automatic when nodes added/removed</w:t>
+      </w:r>
     </w:p>
     <w:p>
       <w:pPr>
@@ -1194,33 +1028,21 @@
         </w:numPr>
         <w:spacing w:after="0"/>
         <w:rPr>
-          <w:rFonts w:ascii="Aptos" w:eastAsia="Aptos" w:hAnsi="Aptos" w:cs="Aptos"/>
-        </w:rPr>
-      </w:pPr>
-      <w:r>
-        <w:rPr>
-          <w:rFonts w:ascii="Aptos" w:eastAsia="Aptos" w:hAnsi="Aptos" w:cs="Aptos"/>
-        </w:rPr>
-        <w:t xml:space="preserve">vs Part 2: manual sharding </w:t>
-      </w:r>
-      <w:r>
-        <w:rPr>
-          <w:rFonts w:ascii="Aptos" w:eastAsia="Aptos" w:hAnsi="Aptos" w:cs="Aptos"/>
-        </w:rPr>
-        <w:t>=</w:t>
-      </w:r>
-      <w:r>
-        <w:rPr>
-          <w:rFonts w:ascii="Aptos" w:eastAsia="Aptos" w:hAnsi="Aptos" w:cs="Aptos"/>
-        </w:rPr>
-        <w:t xml:space="preserve"> hot shards, uneven data</w:t>
+          <w:rFonts w:eastAsia="Aptos" w:cs="Aptos"/>
+        </w:rPr>
+      </w:pPr>
+      <w:r>
+        <w:rPr>
+          <w:rFonts w:eastAsia="Aptos" w:cs="Aptos"/>
+        </w:rPr>
+        <w:t>vs Part 2: manual sharding = hot shards, uneven data</w:t>
       </w:r>
     </w:p>
     <w:p>
       <w:pPr>
         <w:spacing w:after="0"/>
         <w:rPr>
-          <w:rFonts w:ascii="Aptos" w:eastAsia="Aptos" w:hAnsi="Aptos" w:cs="Aptos"/>
+          <w:rFonts w:eastAsia="Aptos" w:cs="Aptos"/>
         </w:rPr>
       </w:pPr>
     </w:p>
@@ -1230,7 +1052,7 @@
       </w:pPr>
       <w:r>
         <w:rPr>
-          <w:rFonts w:ascii="Aptos" w:eastAsia="Aptos" w:hAnsi="Aptos" w:cs="Aptos"/>
+          <w:rFonts w:eastAsia="Aptos" w:cs="Aptos"/>
         </w:rPr>
         <w:t>Slide: Consistency &amp; Transactions</w:t>
       </w:r>
@@ -1239,7 +1061,7 @@
       <w:pPr>
         <w:spacing w:after="0"/>
         <w:rPr>
-          <w:rFonts w:ascii="Aptos" w:eastAsia="Aptos" w:hAnsi="Aptos" w:cs="Aptos"/>
+          <w:rFonts w:eastAsia="Aptos" w:cs="Aptos"/>
         </w:rPr>
       </w:pPr>
     </w:p>
@@ -1252,18 +1074,18 @@
         </w:numPr>
         <w:spacing w:after="0"/>
         <w:rPr>
-          <w:rFonts w:ascii="Aptos" w:eastAsia="Aptos" w:hAnsi="Aptos" w:cs="Aptos"/>
-        </w:rPr>
-      </w:pPr>
-      <w:r>
-        <w:rPr>
-          <w:rFonts w:ascii="Aptos" w:eastAsia="Aptos" w:hAnsi="Aptos" w:cs="Aptos"/>
+          <w:rFonts w:eastAsia="Aptos" w:cs="Aptos"/>
+        </w:rPr>
+      </w:pPr>
+      <w:r>
+        <w:rPr>
+          <w:rFonts w:eastAsia="Aptos" w:cs="Aptos"/>
         </w:rPr>
         <w:t xml:space="preserve">Full ACID transactions with strict </w:t>
       </w:r>
       <w:r>
         <w:rPr>
-          <w:rFonts w:ascii="Aptos" w:eastAsia="Aptos" w:hAnsi="Aptos" w:cs="Aptos"/>
+          <w:rFonts w:eastAsia="Aptos" w:cs="Aptos"/>
         </w:rPr>
         <w:t>serializability</w:t>
       </w:r>
@@ -1277,12 +1099,12 @@
         </w:numPr>
         <w:spacing w:after="0"/>
         <w:rPr>
-          <w:rFonts w:ascii="Aptos" w:eastAsia="Aptos" w:hAnsi="Aptos" w:cs="Aptos"/>
-        </w:rPr>
-      </w:pPr>
-      <w:r>
-        <w:rPr>
-          <w:rFonts w:ascii="Aptos" w:eastAsia="Aptos" w:hAnsi="Aptos" w:cs="Aptos"/>
+          <w:rFonts w:eastAsia="Aptos" w:cs="Aptos"/>
+        </w:rPr>
+      </w:pPr>
+      <w:r>
+        <w:rPr>
+          <w:rFonts w:eastAsia="Aptos" w:cs="Aptos"/>
         </w:rPr>
         <w:t xml:space="preserve">Optimistic concurrency control </w:t>
       </w:r>
@@ -1296,12 +1118,12 @@
         </w:numPr>
         <w:spacing w:after="0"/>
         <w:rPr>
-          <w:rFonts w:ascii="Aptos" w:eastAsia="Aptos" w:hAnsi="Aptos" w:cs="Aptos"/>
-        </w:rPr>
-      </w:pPr>
-      <w:r>
-        <w:rPr>
-          <w:rFonts w:ascii="Aptos" w:eastAsia="Aptos" w:hAnsi="Aptos" w:cs="Aptos"/>
+          <w:rFonts w:eastAsia="Aptos" w:cs="Aptos"/>
+        </w:rPr>
+      </w:pPr>
+      <w:r>
+        <w:rPr>
+          <w:rFonts w:eastAsia="Aptos" w:cs="Aptos"/>
         </w:rPr>
         <w:t>Active Disk Paxos for fault tolerance</w:t>
       </w:r>
@@ -1315,42 +1137,28 @@
         </w:numPr>
         <w:spacing w:after="0"/>
         <w:rPr>
-          <w:rFonts w:ascii="Aptos" w:eastAsia="Aptos" w:hAnsi="Aptos" w:cs="Aptos"/>
-        </w:rPr>
-      </w:pPr>
-      <w:r>
-        <w:rPr>
-          <w:rFonts w:ascii="Aptos" w:eastAsia="Aptos" w:hAnsi="Aptos" w:cs="Aptos"/>
-        </w:rPr>
-        <w:t xml:space="preserve">vs PostgreSQL: strong but </w:t>
-      </w:r>
-      <w:proofErr w:type="gramStart"/>
-      <w:r>
-        <w:rPr>
-          <w:rFonts w:ascii="Aptos" w:eastAsia="Aptos" w:hAnsi="Aptos" w:cs="Aptos"/>
-        </w:rPr>
-        <w:t>single-node</w:t>
-      </w:r>
-      <w:proofErr w:type="gramEnd"/>
-      <w:r>
-        <w:rPr>
-          <w:rFonts w:ascii="Aptos" w:eastAsia="Aptos" w:hAnsi="Aptos" w:cs="Aptos"/>
-        </w:rPr>
-        <w:t xml:space="preserve"> | vs Cassandra: fast but weaker consistency</w:t>
+          <w:rFonts w:eastAsia="Aptos" w:cs="Aptos"/>
+        </w:rPr>
+      </w:pPr>
+      <w:r>
+        <w:rPr>
+          <w:rFonts w:eastAsia="Aptos" w:cs="Aptos"/>
+        </w:rPr>
+        <w:t>vs PostgreSQL: strong but single-node | vs Cassandra: fast but weaker consistency</w:t>
       </w:r>
     </w:p>
     <w:p>
       <w:pPr>
         <w:spacing w:after="0"/>
         <w:rPr>
-          <w:rFonts w:ascii="Aptos" w:eastAsia="Aptos" w:hAnsi="Aptos" w:cs="Aptos"/>
-        </w:rPr>
-      </w:pPr>
-    </w:p>
-    <w:p>
-      <w:pPr>
-        <w:rPr>
-          <w:rFonts w:ascii="Aptos" w:eastAsia="Aptos" w:hAnsi="Aptos" w:cs="Aptos"/>
+          <w:rFonts w:eastAsia="Aptos" w:cs="Aptos"/>
+        </w:rPr>
+      </w:pPr>
+    </w:p>
+    <w:p>
+      <w:pPr>
+        <w:rPr>
+          <w:rFonts w:eastAsia="Aptos" w:cs="Aptos"/>
         </w:rPr>
       </w:pPr>
     </w:p>
@@ -1360,6 +1168,7 @@
       <w:pPr>
         <w:pStyle w:val="Heading1"/>
         <w:rPr>
+          <w:rFonts w:asciiTheme="minorHAnsi" w:hAnsiTheme="minorHAnsi"/>
           <w:sz w:val="24"/>
           <w:szCs w:val="24"/>
         </w:rPr>
@@ -1367,60 +1176,33 @@
       <w:commentRangeStart w:id="2"/>
       <w:r>
         <w:rPr>
+          <w:rFonts w:asciiTheme="minorHAnsi" w:hAnsiTheme="minorHAnsi"/>
           <w:sz w:val="24"/>
           <w:szCs w:val="24"/>
         </w:rPr>
-        <w:t>TechRetail Evaluation (2 min) — Which Part 1–3 component could this system replace?</w:t>
-      </w:r>
-      <w:r>
-        <w:rPr>
+        <w:t>TechRetail Evaluation (2 min) — Which Part 1–3 component could this system replace? What are the trade-o</w:t>
+      </w:r>
+      <w:r>
+        <w:rPr>
+          <w:rFonts w:ascii="Cambria Math" w:hAnsi="Cambria Math" w:cs="Cambria Math"/>
           <w:sz w:val="24"/>
           <w:szCs w:val="24"/>
         </w:rPr>
-        <w:t xml:space="preserve"> </w:t>
-      </w:r>
-      <w:r>
-        <w:rPr>
+        <w:t>ﬀ</w:t>
+      </w:r>
+      <w:r>
+        <w:rPr>
+          <w:rFonts w:asciiTheme="minorHAnsi" w:hAnsiTheme="minorHAnsi"/>
           <w:sz w:val="24"/>
           <w:szCs w:val="24"/>
         </w:rPr>
-        <w:t xml:space="preserve">What </w:t>
-      </w:r>
-      <w:proofErr w:type="gramStart"/>
-      <w:r>
-        <w:rPr>
-          <w:sz w:val="24"/>
-          <w:szCs w:val="24"/>
-        </w:rPr>
-        <w:t>are</w:t>
-      </w:r>
-      <w:proofErr w:type="gramEnd"/>
-      <w:r>
-        <w:rPr>
-          <w:sz w:val="24"/>
-          <w:szCs w:val="24"/>
-        </w:rPr>
-        <w:t xml:space="preserve"> the trade-o</w:t>
-      </w:r>
-      <w:r>
-        <w:rPr>
-          <w:rFonts w:ascii="Times New Roman" w:hAnsi="Times New Roman" w:cs="Times New Roman"/>
-          <w:sz w:val="24"/>
-          <w:szCs w:val="24"/>
-        </w:rPr>
-        <w:t>ﬀ</w:t>
-      </w:r>
-      <w:r>
-        <w:rPr>
-          <w:sz w:val="24"/>
-          <w:szCs w:val="24"/>
-        </w:rPr>
         <w:t>s? Must include a comparison table.</w:t>
       </w:r>
       <w:commentRangeEnd w:id="2"/>
       <w:r>
         <w:rPr>
           <w:rStyle w:val="CommentReference"/>
+          <w:rFonts w:asciiTheme="minorHAnsi" w:hAnsiTheme="minorHAnsi"/>
           <w:sz w:val="24"/>
           <w:szCs w:val="24"/>
         </w:rPr>
@@ -1435,48 +1217,48 @@
           <w:numId w:val="5"/>
         </w:numPr>
         <w:rPr>
-          <w:rFonts w:ascii="Aptos" w:eastAsia="Aptos" w:hAnsi="Aptos" w:cs="Aptos"/>
-        </w:rPr>
-      </w:pPr>
-      <w:r>
-        <w:rPr>
-          <w:rFonts w:ascii="Aptos" w:eastAsia="Aptos" w:hAnsi="Aptos" w:cs="Aptos"/>
+          <w:rFonts w:eastAsia="Aptos" w:cs="Aptos"/>
+        </w:rPr>
+      </w:pPr>
+      <w:r>
+        <w:rPr>
+          <w:rFonts w:eastAsia="Aptos" w:cs="Aptos"/>
         </w:rPr>
         <w:t xml:space="preserve">FoundationDB is </w:t>
       </w:r>
       <w:r>
         <w:rPr>
-          <w:rFonts w:ascii="Aptos" w:eastAsia="Aptos" w:hAnsi="Aptos" w:cs="Aptos"/>
+          <w:rFonts w:eastAsia="Aptos" w:cs="Aptos"/>
         </w:rPr>
         <w:t>the strongest</w:t>
       </w:r>
       <w:r>
         <w:rPr>
-          <w:rFonts w:ascii="Aptos" w:eastAsia="Aptos" w:hAnsi="Aptos" w:cs="Aptos"/>
+          <w:rFonts w:eastAsia="Aptos" w:cs="Aptos"/>
         </w:rPr>
         <w:t xml:space="preserve"> replace</w:t>
       </w:r>
       <w:r>
         <w:rPr>
-          <w:rFonts w:ascii="Aptos" w:eastAsia="Aptos" w:hAnsi="Aptos" w:cs="Aptos"/>
+          <w:rFonts w:eastAsia="Aptos" w:cs="Aptos"/>
         </w:rPr>
         <w:t>ment for</w:t>
       </w:r>
       <w:r>
         <w:rPr>
-          <w:rFonts w:ascii="Aptos" w:eastAsia="Aptos" w:hAnsi="Aptos" w:cs="Aptos"/>
+          <w:rFonts w:eastAsia="Aptos" w:cs="Aptos"/>
         </w:rPr>
         <w:t xml:space="preserve"> t</w:t>
       </w:r>
       <w:r>
         <w:rPr>
-          <w:rFonts w:ascii="Aptos" w:eastAsia="Aptos" w:hAnsi="Aptos" w:cs="Aptos"/>
+          <w:rFonts w:eastAsia="Aptos" w:cs="Aptos"/>
         </w:rPr>
         <w:t xml:space="preserve">he </w:t>
       </w:r>
       <w:r>
         <w:rPr>
-          <w:rFonts w:ascii="Aptos" w:eastAsia="Aptos" w:hAnsi="Aptos" w:cs="Aptos"/>
+          <w:rFonts w:eastAsia="Aptos" w:cs="Aptos"/>
         </w:rPr>
         <w:t xml:space="preserve">sharded sales layer from Part 2. </w:t>
       </w:r>
@@ -1489,54 +1271,54 @@
           <w:numId w:val="5"/>
         </w:numPr>
         <w:rPr>
-          <w:rFonts w:ascii="Aptos" w:eastAsia="Aptos" w:hAnsi="Aptos" w:cs="Aptos"/>
-        </w:rPr>
-      </w:pPr>
-      <w:r>
-        <w:rPr>
-          <w:rFonts w:ascii="Aptos" w:eastAsia="Aptos" w:hAnsi="Aptos" w:cs="Aptos"/>
+          <w:rFonts w:eastAsia="Aptos" w:cs="Aptos"/>
+        </w:rPr>
+      </w:pPr>
+      <w:r>
+        <w:rPr>
+          <w:rFonts w:eastAsia="Aptos" w:cs="Aptos"/>
         </w:rPr>
         <w:t>S</w:t>
       </w:r>
       <w:r>
         <w:rPr>
-          <w:rFonts w:ascii="Aptos" w:eastAsia="Aptos" w:hAnsi="Aptos" w:cs="Aptos"/>
+          <w:rFonts w:eastAsia="Aptos" w:cs="Aptos"/>
         </w:rPr>
         <w:t>plit</w:t>
       </w:r>
       <w:r>
         <w:rPr>
-          <w:rFonts w:ascii="Aptos" w:eastAsia="Aptos" w:hAnsi="Aptos" w:cs="Aptos"/>
+          <w:rFonts w:eastAsia="Aptos" w:cs="Aptos"/>
         </w:rPr>
         <w:t>ting</w:t>
       </w:r>
       <w:r>
         <w:rPr>
-          <w:rFonts w:ascii="Aptos" w:eastAsia="Aptos" w:hAnsi="Aptos" w:cs="Aptos"/>
+          <w:rFonts w:eastAsia="Aptos" w:cs="Aptos"/>
         </w:rPr>
         <w:t xml:space="preserve"> data into Southeast and Northeast shards led to uneven distribution, hot shards, and required application-level logic for cross-shard queries.</w:t>
       </w:r>
       <w:r>
         <w:rPr>
-          <w:rFonts w:ascii="Aptos" w:eastAsia="Aptos" w:hAnsi="Aptos" w:cs="Aptos"/>
+          <w:rFonts w:eastAsia="Aptos" w:cs="Aptos"/>
         </w:rPr>
         <w:t xml:space="preserve"> But I don’t recommend </w:t>
       </w:r>
       <w:r>
         <w:rPr>
-          <w:rFonts w:ascii="Aptos" w:eastAsia="Aptos" w:hAnsi="Aptos" w:cs="Aptos"/>
+          <w:rFonts w:eastAsia="Aptos" w:cs="Aptos"/>
         </w:rPr>
         <w:t>replacing</w:t>
       </w:r>
       <w:r>
         <w:rPr>
-          <w:rFonts w:ascii="Aptos" w:eastAsia="Aptos" w:hAnsi="Aptos" w:cs="Aptos"/>
+          <w:rFonts w:eastAsia="Aptos" w:cs="Aptos"/>
         </w:rPr>
         <w:t xml:space="preserve"> Cassandra and PostgreSQL. </w:t>
       </w:r>
       <w:r>
         <w:rPr>
-          <w:rFonts w:ascii="Aptos" w:eastAsia="Aptos" w:hAnsi="Aptos" w:cs="Aptos"/>
+          <w:rFonts w:eastAsia="Aptos" w:cs="Aptos"/>
         </w:rPr>
         <w:t>Here is the why with details.</w:t>
       </w:r>
@@ -1549,18 +1331,18 @@
           <w:numId w:val="4"/>
         </w:numPr>
         <w:rPr>
-          <w:rFonts w:ascii="Aptos" w:eastAsia="Aptos" w:hAnsi="Aptos" w:cs="Aptos"/>
-        </w:rPr>
-      </w:pPr>
-      <w:r>
-        <w:rPr>
-          <w:rFonts w:ascii="Aptos" w:eastAsia="Aptos" w:hAnsi="Aptos" w:cs="Aptos"/>
+          <w:rFonts w:eastAsia="Aptos" w:cs="Aptos"/>
+        </w:rPr>
+      </w:pPr>
+      <w:r>
+        <w:rPr>
+          <w:rFonts w:eastAsia="Aptos" w:cs="Aptos"/>
         </w:rPr>
         <w:t>C</w:t>
       </w:r>
       <w:r>
         <w:rPr>
-          <w:rFonts w:ascii="Aptos" w:eastAsia="Aptos" w:hAnsi="Aptos" w:cs="Aptos"/>
+          <w:rFonts w:eastAsia="Aptos" w:cs="Aptos"/>
         </w:rPr>
         <w:t>omparison table</w:t>
       </w:r>
@@ -1573,30 +1355,30 @@
           <w:numId w:val="4"/>
         </w:numPr>
         <w:rPr>
-          <w:rFonts w:ascii="Aptos" w:eastAsia="Aptos" w:hAnsi="Aptos" w:cs="Aptos"/>
-        </w:rPr>
-      </w:pPr>
-      <w:r>
-        <w:rPr>
-          <w:rFonts w:ascii="Aptos" w:eastAsia="Aptos" w:hAnsi="Aptos" w:cs="Aptos"/>
+          <w:rFonts w:eastAsia="Aptos" w:cs="Aptos"/>
+        </w:rPr>
+      </w:pPr>
+      <w:r>
+        <w:rPr>
+          <w:rFonts w:eastAsia="Aptos" w:cs="Aptos"/>
         </w:rPr>
         <w:t xml:space="preserve"> FoundationDB </w:t>
       </w:r>
       <w:r>
         <w:rPr>
-          <w:rFonts w:ascii="Aptos" w:eastAsia="Aptos" w:hAnsi="Aptos" w:cs="Aptos"/>
+          <w:rFonts w:eastAsia="Aptos" w:cs="Aptos"/>
         </w:rPr>
         <w:t xml:space="preserve">is less </w:t>
       </w:r>
       <w:r>
         <w:rPr>
-          <w:rFonts w:ascii="Aptos" w:eastAsia="Aptos" w:hAnsi="Aptos" w:cs="Aptos"/>
+          <w:rFonts w:eastAsia="Aptos" w:cs="Aptos"/>
         </w:rPr>
         <w:t>complex by automatically distributing and rebalancing data across nodes.</w:t>
       </w:r>
       <w:r>
         <w:rPr>
-          <w:rFonts w:ascii="Aptos" w:eastAsia="Aptos" w:hAnsi="Aptos" w:cs="Aptos"/>
+          <w:rFonts w:ascii="MS Gothic" w:eastAsia="MS Gothic" w:hAnsi="MS Gothic" w:cs="MS Gothic" w:hint="eastAsia"/>
         </w:rPr>
         <w:t xml:space="preserve">　</w:t>
       </w:r>
@@ -1609,7 +1391,7 @@
           <w:numId w:val="4"/>
         </w:numPr>
         <w:rPr>
-          <w:rFonts w:ascii="Aptos" w:eastAsia="Aptos" w:hAnsi="Aptos" w:cs="Aptos"/>
+          <w:rFonts w:eastAsia="Aptos" w:cs="Aptos"/>
         </w:rPr>
       </w:pPr>
     </w:p>
@@ -1621,12 +1403,12 @@
           <w:numId w:val="3"/>
         </w:numPr>
         <w:rPr>
-          <w:rFonts w:ascii="Aptos" w:eastAsia="Aptos" w:hAnsi="Aptos" w:cs="Aptos"/>
-        </w:rPr>
-      </w:pPr>
-      <w:r>
-        <w:rPr>
-          <w:rFonts w:ascii="Aptos" w:eastAsia="Aptos" w:hAnsi="Aptos" w:cs="Aptos"/>
+          <w:rFonts w:eastAsia="Aptos" w:cs="Aptos"/>
+        </w:rPr>
+      </w:pPr>
+      <w:r>
+        <w:rPr>
+          <w:rFonts w:eastAsia="Aptos" w:cs="Aptos"/>
         </w:rPr>
         <w:t>system perspective</w:t>
       </w:r>
@@ -1639,36 +1421,36 @@
           <w:numId w:val="3"/>
         </w:numPr>
         <w:rPr>
-          <w:rFonts w:ascii="Aptos" w:eastAsia="Aptos" w:hAnsi="Aptos" w:cs="Aptos"/>
-        </w:rPr>
-      </w:pPr>
-      <w:r>
-        <w:rPr>
-          <w:rFonts w:ascii="Aptos" w:eastAsia="Aptos" w:hAnsi="Aptos" w:cs="Aptos"/>
+          <w:rFonts w:eastAsia="Aptos" w:cs="Aptos"/>
+        </w:rPr>
+      </w:pPr>
+      <w:r>
+        <w:rPr>
+          <w:rFonts w:eastAsia="Aptos" w:cs="Aptos"/>
         </w:rPr>
         <w:t>docker-compose setup</w:t>
       </w:r>
       <w:r>
         <w:rPr>
-          <w:rFonts w:ascii="Aptos" w:eastAsia="Aptos" w:hAnsi="Aptos" w:cs="Aptos"/>
+          <w:rFonts w:eastAsia="Aptos" w:cs="Aptos"/>
         </w:rPr>
         <w:t>:</w:t>
       </w:r>
       <w:r>
         <w:rPr>
-          <w:rFonts w:ascii="Aptos" w:eastAsia="Aptos" w:hAnsi="Aptos" w:cs="Aptos"/>
+          <w:rFonts w:eastAsia="Aptos" w:cs="Aptos"/>
         </w:rPr>
         <w:t xml:space="preserve"> Instead of running multiple PostgreSQL shard containers, we would run </w:t>
       </w:r>
       <w:r>
         <w:rPr>
-          <w:rFonts w:ascii="Aptos" w:eastAsia="Aptos" w:hAnsi="Aptos" w:cs="Aptos"/>
+          <w:rFonts w:eastAsia="Aptos" w:cs="Aptos"/>
         </w:rPr>
         <w:t xml:space="preserve">one </w:t>
       </w:r>
       <w:r>
         <w:rPr>
-          <w:rFonts w:ascii="Aptos" w:eastAsia="Aptos" w:hAnsi="Aptos" w:cs="Aptos"/>
+          <w:rFonts w:eastAsia="Aptos" w:cs="Aptos"/>
         </w:rPr>
         <w:t xml:space="preserve">FoundationDB cluster with several nodes, and the application would connect to a single logical database instead of multiple shard endpoints. </w:t>
       </w:r>
@@ -1681,18 +1463,18 @@
           <w:numId w:val="3"/>
         </w:numPr>
         <w:rPr>
-          <w:rFonts w:ascii="Aptos" w:eastAsia="Aptos" w:hAnsi="Aptos" w:cs="Aptos"/>
-        </w:rPr>
-      </w:pPr>
-      <w:r>
-        <w:rPr>
-          <w:rFonts w:ascii="Aptos" w:eastAsia="Aptos" w:hAnsi="Aptos" w:cs="Aptos"/>
+          <w:rFonts w:eastAsia="Aptos" w:cs="Aptos"/>
+        </w:rPr>
+      </w:pPr>
+      <w:r>
+        <w:rPr>
+          <w:rFonts w:eastAsia="Aptos" w:cs="Aptos"/>
         </w:rPr>
         <w:t>As a result, ET</w:t>
       </w:r>
       <w:r>
         <w:rPr>
-          <w:rFonts w:ascii="Aptos" w:eastAsia="Aptos" w:hAnsi="Aptos" w:cs="Aptos"/>
+          <w:rFonts w:eastAsia="Aptos" w:cs="Aptos"/>
         </w:rPr>
         <w:t>L pipeline would no longer need to extract from multiple shards and merge the data, reducing complexity.</w:t>
       </w:r>
@@ -1708,7 +1490,7 @@
       </w:pPr>
       <w:r>
         <w:rPr>
-          <w:rFonts w:ascii="Aptos" w:eastAsia="Aptos" w:hAnsi="Aptos" w:cs="Aptos"/>
+          <w:rFonts w:eastAsia="Aptos" w:cs="Aptos"/>
         </w:rPr>
         <w:t xml:space="preserve">Which means, </w:t>
       </w:r>
@@ -1725,12 +1507,12 @@
         </w:numPr>
         <w:spacing w:before="240" w:after="240"/>
         <w:rPr>
-          <w:rFonts w:ascii="Aptos" w:eastAsia="Aptos" w:hAnsi="Aptos" w:cs="Aptos"/>
-        </w:rPr>
-      </w:pPr>
-      <w:r>
-        <w:rPr>
-          <w:rFonts w:ascii="Aptos" w:eastAsia="Aptos" w:hAnsi="Aptos" w:cs="Aptos"/>
+          <w:rFonts w:eastAsia="Aptos" w:cs="Aptos"/>
+        </w:rPr>
+      </w:pPr>
+      <w:r>
+        <w:rPr>
+          <w:rFonts w:eastAsia="Aptos" w:cs="Aptos"/>
         </w:rPr>
         <w:lastRenderedPageBreak/>
         <w:t xml:space="preserve"> Tradeoff</w:t>
@@ -1745,42 +1527,42 @@
         </w:numPr>
         <w:spacing w:before="240" w:after="240"/>
         <w:rPr>
-          <w:rFonts w:ascii="Aptos" w:eastAsia="Aptos" w:hAnsi="Aptos" w:cs="Aptos"/>
-        </w:rPr>
-      </w:pPr>
-      <w:r>
-        <w:rPr>
-          <w:rFonts w:ascii="Aptos" w:eastAsia="Aptos" w:hAnsi="Aptos" w:cs="Aptos"/>
+          <w:rFonts w:eastAsia="Aptos" w:cs="Aptos"/>
+        </w:rPr>
+      </w:pPr>
+      <w:r>
+        <w:rPr>
+          <w:rFonts w:eastAsia="Aptos" w:cs="Aptos"/>
         </w:rPr>
         <w:t xml:space="preserve"> </w:t>
       </w:r>
       <w:r>
         <w:rPr>
-          <w:rFonts w:ascii="Aptos" w:eastAsia="Aptos" w:hAnsi="Aptos" w:cs="Aptos"/>
+          <w:rFonts w:eastAsia="Aptos" w:cs="Aptos"/>
         </w:rPr>
         <w:t>N</w:t>
       </w:r>
       <w:r>
         <w:rPr>
-          <w:rFonts w:ascii="Aptos" w:eastAsia="Aptos" w:hAnsi="Aptos" w:cs="Aptos"/>
+          <w:rFonts w:eastAsia="Aptos" w:cs="Aptos"/>
         </w:rPr>
         <w:t>o full SQL support out of the box</w:t>
       </w:r>
       <w:r>
         <w:rPr>
-          <w:rFonts w:ascii="Aptos" w:eastAsia="Aptos" w:hAnsi="Aptos" w:cs="Aptos"/>
+          <w:rFonts w:eastAsia="Aptos" w:cs="Aptos"/>
         </w:rPr>
         <w:t xml:space="preserve">. </w:t>
       </w:r>
       <w:r>
         <w:rPr>
-          <w:rFonts w:ascii="Aptos" w:eastAsia="Aptos" w:hAnsi="Aptos" w:cs="Aptos"/>
+          <w:rFonts w:eastAsia="Aptos" w:cs="Aptos"/>
         </w:rPr>
         <w:t>so,</w:t>
       </w:r>
       <w:r>
         <w:rPr>
-          <w:rFonts w:ascii="Aptos" w:eastAsia="Aptos" w:hAnsi="Aptos" w:cs="Aptos"/>
+          <w:rFonts w:eastAsia="Aptos" w:cs="Aptos"/>
         </w:rPr>
         <w:t xml:space="preserve"> query functionality may require additional layers or custom development. </w:t>
       </w:r>
@@ -1794,30 +1576,30 @@
         </w:numPr>
         <w:spacing w:before="240" w:after="240"/>
         <w:rPr>
-          <w:rFonts w:ascii="Aptos" w:eastAsia="Aptos" w:hAnsi="Aptos" w:cs="Aptos"/>
-        </w:rPr>
-      </w:pPr>
-      <w:r>
-        <w:rPr>
-          <w:rFonts w:ascii="Aptos" w:eastAsia="Aptos" w:hAnsi="Aptos" w:cs="Aptos"/>
+          <w:rFonts w:eastAsia="Aptos" w:cs="Aptos"/>
+        </w:rPr>
+      </w:pPr>
+      <w:r>
+        <w:rPr>
+          <w:rFonts w:eastAsia="Aptos" w:cs="Aptos"/>
         </w:rPr>
         <w:t>W</w:t>
       </w:r>
       <w:r>
         <w:rPr>
-          <w:rFonts w:ascii="Aptos" w:eastAsia="Aptos" w:hAnsi="Aptos" w:cs="Aptos"/>
+          <w:rFonts w:eastAsia="Aptos" w:cs="Aptos"/>
         </w:rPr>
         <w:t xml:space="preserve">eaker </w:t>
       </w:r>
       <w:r>
         <w:rPr>
-          <w:rFonts w:ascii="Aptos" w:eastAsia="Aptos" w:hAnsi="Aptos" w:cs="Aptos"/>
+          <w:rFonts w:eastAsia="Aptos" w:cs="Aptos"/>
         </w:rPr>
         <w:t>fits</w:t>
       </w:r>
       <w:r>
         <w:rPr>
-          <w:rFonts w:ascii="Aptos" w:eastAsia="Aptos" w:hAnsi="Aptos" w:cs="Aptos"/>
+          <w:rFonts w:eastAsia="Aptos" w:cs="Aptos"/>
         </w:rPr>
         <w:t xml:space="preserve"> for Cassandra ingestion, since Cassandra is optimized for extremely high write throughput, while FoundationDB prioritizes strong consistency. </w:t>
       </w:r>
@@ -1831,38 +1613,43 @@
         </w:numPr>
         <w:spacing w:before="240" w:after="240"/>
         <w:rPr>
-          <w:rFonts w:ascii="Aptos" w:eastAsia="Aptos" w:hAnsi="Aptos" w:cs="Aptos"/>
-        </w:rPr>
-      </w:pPr>
-      <w:r>
-        <w:rPr>
-          <w:rFonts w:ascii="Aptos" w:eastAsia="Aptos" w:hAnsi="Aptos" w:cs="Aptos"/>
+          <w:rFonts w:eastAsia="Aptos" w:cs="Aptos"/>
+        </w:rPr>
+      </w:pPr>
+      <w:r>
+        <w:rPr>
+          <w:rFonts w:eastAsia="Aptos" w:cs="Aptos"/>
         </w:rPr>
         <w:t>Finally, it cannot replace the PostgreSQL warehouse, which relies on SQL joins and analytical queries.</w:t>
       </w:r>
     </w:p>
     <w:p>
       <w:pPr>
-        <w:spacing w:before="240" w:after="240"/>
-      </w:pPr>
-      <w:r>
-        <w:rPr>
-          <w:rFonts w:ascii="Aptos" w:eastAsia="Aptos" w:hAnsi="Aptos" w:cs="Aptos"/>
-        </w:rPr>
-        <w:t>So overall, FoundationDB simplifies scaling and consistency by replacing the sales shards, but it introduces more complexity in query modeling and still requires other systems for ingestion and analytics.”</w:t>
-      </w:r>
-    </w:p>
-    <w:p>
-      <w:pPr>
-        <w:rPr>
-          <w:rFonts w:ascii="Aptos" w:eastAsia="Aptos" w:hAnsi="Aptos" w:cs="Aptos"/>
-        </w:rPr>
-      </w:pPr>
-    </w:p>
-    <w:p>
-      <w:pPr>
-        <w:rPr>
-          <w:rFonts w:ascii="Aptos" w:eastAsia="Aptos" w:hAnsi="Aptos" w:cs="Aptos"/>
+        <w:rPr>
+          <w:rFonts w:eastAsia="Aptos" w:cs="Aptos"/>
+        </w:rPr>
+      </w:pPr>
+    </w:p>
+    <w:p>
+      <w:pPr>
+        <w:spacing w:before="100" w:beforeAutospacing="1" w:after="100" w:afterAutospacing="1" w:line="240" w:lineRule="auto"/>
+        <w:rPr>
+          <w:rFonts w:eastAsia="Times New Roman" w:cs="Times New Roman"/>
+          <w:lang w:eastAsia="en-US"/>
+        </w:rPr>
+      </w:pPr>
+      <w:r>
+        <w:rPr>
+          <w:rFonts w:eastAsia="Times New Roman" w:cs="Times New Roman"/>
+          <w:lang w:eastAsia="en-US"/>
+        </w:rPr>
+        <w:t>Although implementing FoundationDB requires upfront investment in engineering, migration, and infrastructure, the long-term value can strongly outweigh the cost because it reduces the need to manage separate systems like PostgreSQL shards, Cassandra, and multiple synchronization pipelines between them. By combining strong ACID transactions, automatic horizontal scaling, and high write throughput in one distributed platform, FoundationDB can lower operational complexity, reduce data inconsistency risks, and cut the ongoing cost of maintaining multiple databases and integration layers. For a company, the real business case is not just buying another database, but investing in a simpler, more scalable architecture that can improve reliability, support growth, and reduce technical overhead over time.</w:t>
+      </w:r>
+    </w:p>
+    <w:p>
+      <w:pPr>
+        <w:rPr>
+          <w:rFonts w:eastAsia="Aptos" w:cs="Aptos"/>
         </w:rPr>
       </w:pPr>
     </w:p>
@@ -1870,6 +1657,7 @@
       <w:pPr>
         <w:pStyle w:val="Heading1"/>
         <w:rPr>
+          <w:rFonts w:asciiTheme="minorHAnsi" w:hAnsiTheme="minorHAnsi"/>
           <w:sz w:val="24"/>
           <w:szCs w:val="24"/>
         </w:rPr>
@@ -1877,156 +1665,147 @@
       <w:commentRangeStart w:id="3"/>
       <w:r>
         <w:rPr>
+          <w:rFonts w:asciiTheme="minorHAnsi" w:hAnsiTheme="minorHAnsi"/>
           <w:sz w:val="24"/>
           <w:szCs w:val="24"/>
         </w:rPr>
-        <w:t>Conclusion (30 sec) — Key takeaway: when would you recommend this system and when</w:t>
-      </w:r>
-      <w:r>
-        <w:rPr>
+        <w:t>Conclusion (30 sec) — Key takeaway: when would you recommend this system and when would you not?</w:t>
+      </w:r>
+      <w:commentRangeEnd w:id="3"/>
+      <w:r>
+        <w:rPr>
+          <w:rStyle w:val="CommentReference"/>
+          <w:rFonts w:asciiTheme="minorHAnsi" w:hAnsiTheme="minorHAnsi"/>
           <w:sz w:val="24"/>
           <w:szCs w:val="24"/>
         </w:rPr>
-        <w:t xml:space="preserve"> </w:t>
-      </w:r>
-      <w:r>
-        <w:rPr>
+        <w:commentReference w:id="3"/>
+      </w:r>
+    </w:p>
+    <w:p>
+      <w:pPr>
+        <w:spacing w:after="120"/>
+        <w:rPr>
+          <w:rFonts w:eastAsia="Aptos" w:cs="Aptos"/>
+          <w:sz w:val="21"/>
+          <w:szCs w:val="21"/>
+        </w:rPr>
+      </w:pPr>
+      <w:r>
+        <w:rPr>
+          <w:b/>
+          <w:bCs/>
+        </w:rPr>
+        <w:t>Recommend</w:t>
+      </w:r>
+      <w:r>
+        <w:t xml:space="preserve"> FoundationDB when you need </w:t>
+      </w:r>
+      <w:r>
+        <w:rPr>
+          <w:b/>
+          <w:bCs/>
+        </w:rPr>
+        <w:t>flexible data models</w:t>
+      </w:r>
+      <w:r>
+        <w:t xml:space="preserve"> via the </w:t>
+      </w:r>
+      <w:r>
+        <w:rPr>
+          <w:b/>
+          <w:bCs/>
+        </w:rPr>
+        <w:t>Layer concept</w:t>
+      </w:r>
+      <w:r>
+        <w:t xml:space="preserve"> and </w:t>
+      </w:r>
+      <w:r>
+        <w:rPr>
+          <w:b/>
+          <w:bCs/>
+        </w:rPr>
+        <w:t>linear scalability</w:t>
+      </w:r>
+      <w:r>
+        <w:t xml:space="preserve"> where reads and writes can grow independently. </w:t>
+      </w:r>
+      <w:r>
+        <w:rPr>
+          <w:b/>
+          <w:bCs/>
+        </w:rPr>
+        <w:t>Avoid it</w:t>
+      </w:r>
+      <w:r>
+        <w:t xml:space="preserve"> for </w:t>
+      </w:r>
+      <w:r>
+        <w:rPr>
+          <w:b/>
+          <w:bCs/>
+        </w:rPr>
+        <w:t>long-running transactions</w:t>
+      </w:r>
+      <w:r>
+        <w:t xml:space="preserve"> exceeding </w:t>
+      </w:r>
+      <w:r>
+        <w:rPr>
+          <w:b/>
+          <w:bCs/>
+        </w:rPr>
+        <w:t>five seconds</w:t>
+      </w:r>
+      <w:r>
+        <w:t xml:space="preserve"> or workloads with high </w:t>
+      </w:r>
+      <w:r>
+        <w:rPr>
+          <w:b/>
+          <w:bCs/>
+        </w:rPr>
+        <w:t>data conflicts</w:t>
+      </w:r>
+      <w:r>
+        <w:t xml:space="preserve"> that cause frequent aborts. It is also not ideal if you cannot design </w:t>
+      </w:r>
+      <w:r>
+        <w:rPr>
+          <w:b/>
+          <w:bCs/>
+        </w:rPr>
+        <w:t>idempotent transactions</w:t>
+      </w:r>
+      <w:r>
+        <w:t>, which are required to safely handle commit_result_unknown errors during system recoveries.</w:t>
+      </w:r>
+    </w:p>
+    <w:p/>
+    <w:p>
+      <w:pPr>
+        <w:pStyle w:val="Heading1"/>
+        <w:rPr>
+          <w:rFonts w:asciiTheme="minorHAnsi" w:hAnsiTheme="minorHAnsi"/>
           <w:sz w:val="24"/>
           <w:szCs w:val="24"/>
         </w:rPr>
-        <w:t>would you not?</w:t>
-      </w:r>
-      <w:commentRangeEnd w:id="3"/>
-      <w:r>
-        <w:rPr>
-          <w:rStyle w:val="CommentReference"/>
+      </w:pPr>
+      <w:r>
+        <w:rPr>
+          <w:rFonts w:asciiTheme="minorHAnsi" w:hAnsiTheme="minorHAnsi"/>
           <w:sz w:val="24"/>
           <w:szCs w:val="24"/>
         </w:rPr>
-        <w:commentReference w:id="3"/>
-      </w:r>
-    </w:p>
-    <w:p>
-      <w:pPr>
-        <w:spacing w:after="120"/>
-        <w:rPr>
-          <w:rFonts w:ascii="Aptos" w:eastAsia="Aptos" w:hAnsi="Aptos" w:cs="Aptos"/>
-          <w:sz w:val="21"/>
-          <w:szCs w:val="21"/>
-        </w:rPr>
-      </w:pPr>
-      <w:r>
-        <w:rPr>
-          <w:b/>
-          <w:bCs/>
-        </w:rPr>
-        <w:t>Recommend</w:t>
-      </w:r>
-      <w:r>
-        <w:t xml:space="preserve"> FoundationDB when you need </w:t>
-      </w:r>
-      <w:r>
-        <w:rPr>
-          <w:b/>
-          <w:bCs/>
-        </w:rPr>
-        <w:t>flexible data models</w:t>
-      </w:r>
-      <w:r>
-        <w:t xml:space="preserve"> via the </w:t>
-      </w:r>
-      <w:r>
-        <w:rPr>
-          <w:b/>
-          <w:bCs/>
-        </w:rPr>
-        <w:t>Layer concept</w:t>
-      </w:r>
-      <w:r>
-        <w:t xml:space="preserve"> and </w:t>
-      </w:r>
-      <w:r>
-        <w:rPr>
-          <w:b/>
-          <w:bCs/>
-        </w:rPr>
-        <w:t>linear scalability</w:t>
-      </w:r>
-      <w:r>
-        <w:t xml:space="preserve"> where reads and writes can grow independently. </w:t>
-      </w:r>
-      <w:r>
-        <w:rPr>
-          <w:b/>
-          <w:bCs/>
-        </w:rPr>
-        <w:t>Avoid it</w:t>
-      </w:r>
-      <w:r>
-        <w:t xml:space="preserve"> for </w:t>
-      </w:r>
-      <w:r>
-        <w:rPr>
-          <w:b/>
-          <w:bCs/>
-        </w:rPr>
-        <w:t>long-running transactions</w:t>
-      </w:r>
-      <w:r>
-        <w:t xml:space="preserve"> exceeding </w:t>
-      </w:r>
-      <w:r>
-        <w:rPr>
-          <w:b/>
-          <w:bCs/>
-        </w:rPr>
-        <w:t>five seconds</w:t>
-      </w:r>
-      <w:r>
-        <w:t xml:space="preserve"> or workloads with high </w:t>
-      </w:r>
-      <w:r>
-        <w:rPr>
-          <w:b/>
-          <w:bCs/>
-        </w:rPr>
-        <w:t>data conflicts</w:t>
-      </w:r>
-      <w:r>
-        <w:t xml:space="preserve"> that cause frequent aborts. It is also not ideal if you cannot design </w:t>
-      </w:r>
-      <w:r>
-        <w:rPr>
-          <w:b/>
-          <w:bCs/>
-        </w:rPr>
-        <w:t>idempotent transactions</w:t>
-      </w:r>
-      <w:r>
-        <w:t>, which are required to safely handle commit_result_unknown errors during system recoveries.</w:t>
-      </w:r>
-    </w:p>
-    <w:p/>
+        <w:t>Q&amp;A (2 min) — Questions from the class and instructor.</w:t>
+      </w:r>
+    </w:p>
     <w:p>
       <w:pPr>
         <w:pStyle w:val="Heading1"/>
         <w:rPr>
-          <w:sz w:val="24"/>
-          <w:szCs w:val="24"/>
-        </w:rPr>
-      </w:pPr>
-      <w:r>
-        <w:rPr>
-          <w:sz w:val="24"/>
-          <w:szCs w:val="24"/>
-        </w:rPr>
-        <w:t>Q&amp;A (2 min) — Questions from the class and instructor.</w:t>
-      </w:r>
-    </w:p>
-    <w:p>
-      <w:pPr>
-        <w:pStyle w:val="Heading1"/>
-        <w:rPr>
+          <w:rFonts w:asciiTheme="minorHAnsi" w:hAnsiTheme="minorHAnsi"/>
           <w:sz w:val="24"/>
           <w:szCs w:val="24"/>
         </w:rPr>
@@ -2043,7 +1822,7 @@
 </file>
 
 <file path=word/comments.xml><?xml version="1.0" encoding="utf-8"?>
-<w:comments xmlns:wpc="http://schemas.microsoft.com/office/word/2010/wordprocessingCanvas" xmlns:cx="http://schemas.microsoft.com/office/drawing/2014/chartex" xmlns:cx1="http://schemas.microsoft.com/office/drawing/2015/9/8/chartex" xmlns:cx2="http://schemas.microsoft.com/office/drawing/2015/10/21/chartex" xmlns:cx3="http://schemas.microsoft.com/office/drawing/2016/5/9/chartex" xmlns:cx4="http://schemas.microsoft.com/office/drawing/2016/5/10/chartex" xmlns:cx5="http://schemas.microsoft.com/office/drawing/2016/5/11/chartex" xmlns:cx6="http://schemas.microsoft.com/office/drawing/2016/5/12/chartex" xmlns:cx7="http://schemas.microsoft.com/office/drawing/2016/5/13/chartex" xmlns:cx8="http://schemas.microsoft.com/office/drawing/2016/5/14/chartex" xmlns:mc="http://schemas.openxmlformats.org/markup-compatibility/2006" xmlns:aink="http://schemas.microsoft.com/office/drawing/2016/ink" xmlns:am3d="http://schemas.microsoft.com/office/drawing/2017/model3d" xmlns:o="urn:schemas-microsoft-com:office:office" xmlns:oel="http://schemas.microsoft.com/office/2019/extlst" xmlns:r="http://schemas.openxmlformats.org/officeDocument/2006/relationships" xmlns:m="http://schemas.openxmlformats.org/officeDocument/2006/math" xmlns:v="urn:schemas-microsoft-com:vml" xmlns:wp14="http://schemas.microsoft.com/office/word/2010/wordprocessingDrawing" xmlns:wp="http://schemas.openxmlformats.org/drawingml/2006/wordprocessingDrawing" xmlns:w10="urn:schemas-microsoft-com:office:word" xmlns:w="http://schemas.openxmlformats.org/wordprocessingml/2006/main" xmlns:w14="http://schemas.microsoft.com/office/word/2010/wordml" xmlns:w15="http://schemas.microsoft.com/office/word/2012/wordml" xmlns:w16cex="http://schemas.microsoft.com/office/word/2018/wordml/cex" xmlns:w16cid="http://schemas.microsoft.com/office/word/2016/wordml/cid" xmlns:w16="http://schemas.microsoft.com/office/word/2018/wordml" xmlns:w16sdtdh="http://schemas.microsoft.com/office/word/2020/wordml/sdtdatahash" xmlns:w16se="http://schemas.microsoft.com/office/word/2015/wordml/symex" xmlns:wpg="http://schemas.microsoft.com/office/word/2010/wordprocessingGroup" xmlns:wpi="http://schemas.microsoft.com/office/word/2010/wordprocessingInk" xmlns:wne="http://schemas.microsoft.com/office/word/2006/wordml" xmlns:wps="http://schemas.microsoft.com/office/word/2010/wordprocessingShape" mc:Ignorable="w14 w15 w16se w16cid w16 w16cex w16sdtdh wp14">
+<w:comments xmlns:wpc="http://schemas.microsoft.com/office/word/2010/wordprocessingCanvas" xmlns:cx="http://schemas.microsoft.com/office/drawing/2014/chartex" xmlns:cx1="http://schemas.microsoft.com/office/drawing/2015/9/8/chartex" xmlns:cx2="http://schemas.microsoft.com/office/drawing/2015/10/21/chartex" xmlns:cx3="http://schemas.microsoft.com/office/drawing/2016/5/9/chartex" xmlns:cx4="http://schemas.microsoft.com/office/drawing/2016/5/10/chartex" xmlns:cx5="http://schemas.microsoft.com/office/drawing/2016/5/11/chartex" xmlns:cx6="http://schemas.microsoft.com/office/drawing/2016/5/12/chartex" xmlns:cx7="http://schemas.microsoft.com/office/drawing/2016/5/13/chartex" xmlns:cx8="http://schemas.microsoft.com/office/drawing/2016/5/14/chartex" xmlns:mc="http://schemas.openxmlformats.org/markup-compatibility/2006" xmlns:aink="http://schemas.microsoft.com/office/drawing/2016/ink" xmlns:am3d="http://schemas.microsoft.com/office/drawing/2017/model3d" xmlns:o="urn:schemas-microsoft-com:office:office" xmlns:oel="http://schemas.microsoft.com/office/2019/extlst" xmlns:r="http://schemas.openxmlformats.org/officeDocument/2006/relationships" xmlns:m="http://schemas.openxmlformats.org/officeDocument/2006/math" xmlns:v="urn:schemas-microsoft-com:vml" xmlns:wp14="http://schemas.microsoft.com/office/word/2010/wordprocessingDrawing" xmlns:wp="http://schemas.openxmlformats.org/drawingml/2006/wordprocessingDrawing" xmlns:w10="urn:schemas-microsoft-com:office:word" xmlns:w="http://schemas.openxmlformats.org/wordprocessingml/2006/main" xmlns:w14="http://schemas.microsoft.com/office/word/2010/wordml" xmlns:w15="http://schemas.microsoft.com/office/word/2012/wordml" xmlns:w16cex="http://schemas.microsoft.com/office/word/2018/wordml/cex" xmlns:w16cid="http://schemas.microsoft.com/office/word/2016/wordml/cid" xmlns:w16="http://schemas.microsoft.com/office/word/2018/wordml" xmlns:w16du="http://schemas.microsoft.com/office/word/2023/wordml/word16du" xmlns:w16sdtdh="http://schemas.microsoft.com/office/word/2020/wordml/sdtdatahash" xmlns:w16sdtfl="http://schemas.microsoft.com/office/word/2024/wordml/sdtformatlock" xmlns:w16se="http://schemas.microsoft.com/office/word/2015/wordml/symex" xmlns:wpg="http://schemas.microsoft.com/office/word/2010/wordprocessingGroup" xmlns:wpi="http://schemas.microsoft.com/office/word/2010/wordprocessingInk" xmlns:wne="http://schemas.microsoft.com/office/word/2006/wordml" xmlns:wps="http://schemas.microsoft.com/office/word/2010/wordprocessingShape" mc:Ignorable="w14 w15 w16se w16cid w16 w16cex w16sdtdh w16sdtfl w16du wp14">
   <w:comment w:id="0" w:author="Helen Nguyen" w:date="2026-03-28T18:47:00Z" w:initials="NN">
     <w:p>
       <w:r>
@@ -2116,7 +1895,7 @@
 </file>
 
 <file path=word/commentsExtended.xml><?xml version="1.0" encoding="utf-8"?>
-<w15:commentsEx xmlns:wpc="http://schemas.microsoft.com/office/word/2010/wordprocessingCanvas" xmlns:cx="http://schemas.microsoft.com/office/drawing/2014/chartex" xmlns:cx1="http://schemas.microsoft.com/office/drawing/2015/9/8/chartex" xmlns:cx2="http://schemas.microsoft.com/office/drawing/2015/10/21/chartex" xmlns:cx3="http://schemas.microsoft.com/office/drawing/2016/5/9/chartex" xmlns:cx4="http://schemas.microsoft.com/office/drawing/2016/5/10/chartex" xmlns:cx5="http://schemas.microsoft.com/office/drawing/2016/5/11/chartex" xmlns:cx6="http://schemas.microsoft.com/office/drawing/2016/5/12/chartex" xmlns:cx7="http://schemas.microsoft.com/office/drawing/2016/5/13/chartex" xmlns:cx8="http://schemas.microsoft.com/office/drawing/2016/5/14/chartex" xmlns:mc="http://schemas.openxmlformats.org/markup-compatibility/2006" xmlns:aink="http://schemas.microsoft.com/office/drawing/2016/ink" xmlns:am3d="http://schemas.microsoft.com/office/drawing/2017/model3d" xmlns:o="urn:schemas-microsoft-com:office:office" xmlns:oel="http://schemas.microsoft.com/office/2019/extlst" xmlns:r="http://schemas.openxmlformats.org/officeDocument/2006/relationships" xmlns:m="http://schemas.openxmlformats.org/officeDocument/2006/math" xmlns:v="urn:schemas-microsoft-com:vml" xmlns:wp14="http://schemas.microsoft.com/office/word/2010/wordprocessingDrawing" xmlns:wp="http://schemas.openxmlformats.org/drawingml/2006/wordprocessingDrawing" xmlns:w10="urn:schemas-microsoft-com:office:word" xmlns:w="http://schemas.openxmlformats.org/wordprocessingml/2006/main" xmlns:w14="http://schemas.microsoft.com/office/word/2010/wordml" xmlns:w15="http://schemas.microsoft.com/office/word/2012/wordml" xmlns:w16cex="http://schemas.microsoft.com/office/word/2018/wordml/cex" xmlns:w16cid="http://schemas.microsoft.com/office/word/2016/wordml/cid" xmlns:w16="http://schemas.microsoft.com/office/word/2018/wordml" xmlns:w16sdtdh="http://schemas.microsoft.com/office/word/2020/wordml/sdtdatahash" xmlns:w16se="http://schemas.microsoft.com/office/word/2015/wordml/symex" xmlns:wpg="http://schemas.microsoft.com/office/word/2010/wordprocessingGroup" xmlns:wpi="http://schemas.microsoft.com/office/word/2010/wordprocessingInk" xmlns:wne="http://schemas.microsoft.com/office/word/2006/wordml" xmlns:wps="http://schemas.microsoft.com/office/word/2010/wordprocessingShape" mc:Ignorable="w14 w15 w16se w16cid w16 w16cex w16sdtdh wp14">
+<w15:commentsEx xmlns:wpc="http://schemas.microsoft.com/office/word/2010/wordprocessingCanvas" xmlns:cx="http://schemas.microsoft.com/office/drawing/2014/chartex" xmlns:cx1="http://schemas.microsoft.com/office/drawing/2015/9/8/chartex" xmlns:cx2="http://schemas.microsoft.com/office/drawing/2015/10/21/chartex" xmlns:cx3="http://schemas.microsoft.com/office/drawing/2016/5/9/chartex" xmlns:cx4="http://schemas.microsoft.com/office/drawing/2016/5/10/chartex" xmlns:cx5="http://schemas.microsoft.com/office/drawing/2016/5/11/chartex" xmlns:cx6="http://schemas.microsoft.com/office/drawing/2016/5/12/chartex" xmlns:cx7="http://schemas.microsoft.com/office/drawing/2016/5/13/chartex" xmlns:cx8="http://schemas.microsoft.com/office/drawing/2016/5/14/chartex" xmlns:mc="http://schemas.openxmlformats.org/markup-compatibility/2006" xmlns:aink="http://schemas.microsoft.com/office/drawing/2016/ink" xmlns:am3d="http://schemas.microsoft.com/office/drawing/2017/model3d" xmlns:o="urn:schemas-microsoft-com:office:office" xmlns:oel="http://schemas.microsoft.com/office/2019/extlst" xmlns:r="http://schemas.openxmlformats.org/officeDocument/2006/relationships" xmlns:m="http://schemas.openxmlformats.org/officeDocument/2006/math" xmlns:v="urn:schemas-microsoft-com:vml" xmlns:wp14="http://schemas.microsoft.com/office/word/2010/wordprocessingDrawing" xmlns:wp="http://schemas.openxmlformats.org/drawingml/2006/wordprocessingDrawing" xmlns:w10="urn:schemas-microsoft-com:office:word" xmlns:w="http://schemas.openxmlformats.org/wordprocessingml/2006/main" xmlns:w14="http://schemas.microsoft.com/office/word/2010/wordml" xmlns:w15="http://schemas.microsoft.com/office/word/2012/wordml" xmlns:w16cex="http://schemas.microsoft.com/office/word/2018/wordml/cex" xmlns:w16cid="http://schemas.microsoft.com/office/word/2016/wordml/cid" xmlns:w16="http://schemas.microsoft.com/office/word/2018/wordml" xmlns:w16du="http://schemas.microsoft.com/office/word/2023/wordml/word16du" xmlns:w16sdtdh="http://schemas.microsoft.com/office/word/2020/wordml/sdtdatahash" xmlns:w16sdtfl="http://schemas.microsoft.com/office/word/2024/wordml/sdtformatlock" xmlns:w16se="http://schemas.microsoft.com/office/word/2015/wordml/symex" xmlns:wpg="http://schemas.microsoft.com/office/word/2010/wordprocessingGroup" xmlns:wpi="http://schemas.microsoft.com/office/word/2010/wordprocessingInk" xmlns:wne="http://schemas.microsoft.com/office/word/2006/wordml" xmlns:wps="http://schemas.microsoft.com/office/word/2010/wordprocessingShape" mc:Ignorable="w14 w15 w16se w16cid w16 w16cex w16sdtdh w16sdtfl w16du wp14">
   <w15:commentEx w15:paraId="7E16C328" w15:done="0"/>
   <w15:commentEx w15:paraId="62C1AAF6" w15:done="0"/>
   <w15:commentEx w15:paraId="4FC961B7" w15:done="0"/>
@@ -2125,7 +1904,7 @@
 </file>
 
 <file path=word/commentsExtensible.xml><?xml version="1.0" encoding="utf-8"?>
-<w16cex:commentsExtensible xmlns:wpc="http://schemas.microsoft.com/office/word/2010/wordprocessingCanvas" xmlns:cx="http://schemas.microsoft.com/office/drawing/2014/chartex" xmlns:cx1="http://schemas.microsoft.com/office/drawing/2015/9/8/chartex" xmlns:cx2="http://schemas.microsoft.com/office/drawing/2015/10/21/chartex" xmlns:cx3="http://schemas.microsoft.com/office/drawing/2016/5/9/chartex" xmlns:cx4="http://schemas.microsoft.com/office/drawing/2016/5/10/chartex" xmlns:cx5="http://schemas.microsoft.com/office/drawing/2016/5/11/chartex" xmlns:cx6="http://schemas.microsoft.com/office/drawing/2016/5/12/chartex" xmlns:cx7="http://schemas.microsoft.com/office/drawing/2016/5/13/chartex" xmlns:cx8="http://schemas.microsoft.com/office/drawing/2016/5/14/chartex" xmlns:mc="http://schemas.openxmlformats.org/markup-compatibility/2006" xmlns:aink="http://schemas.microsoft.com/office/drawing/2016/ink" xmlns:am3d="http://schemas.microsoft.com/office/drawing/2017/model3d" xmlns:o="urn:schemas-microsoft-com:office:office" xmlns:oel="http://schemas.microsoft.com/office/2019/extlst" xmlns:r="http://schemas.openxmlformats.org/officeDocument/2006/relationships" xmlns:m="http://schemas.openxmlformats.org/officeDocument/2006/math" xmlns:v="urn:schemas-microsoft-com:vml" xmlns:wp14="http://schemas.microsoft.com/office/word/2010/wordprocessingDrawing" xmlns:wp="http://schemas.openxmlformats.org/drawingml/2006/wordprocessingDrawing" xmlns:w10="urn:schemas-microsoft-com:office:word" xmlns:w="http://schemas.openxmlformats.org/wordprocessingml/2006/main" xmlns:w14="http://schemas.microsoft.com/office/word/2010/wordml" xmlns:w15="http://schemas.microsoft.com/office/word/2012/wordml" xmlns:w16cex="http://schemas.microsoft.com/office/word/2018/wordml/cex" xmlns:w16cid="http://schemas.microsoft.com/office/word/2016/wordml/cid" xmlns:w16="http://schemas.microsoft.com/office/word/2018/wordml" xmlns:w16sdtdh="http://schemas.microsoft.com/office/word/2020/wordml/sdtdatahash" xmlns:w16se="http://schemas.microsoft.com/office/word/2015/wordml/symex" xmlns:wpg="http://schemas.microsoft.com/office/word/2010/wordprocessingGroup" xmlns:wpi="http://schemas.microsoft.com/office/word/2010/wordprocessingInk" xmlns:wne="http://schemas.microsoft.com/office/word/2006/wordml" xmlns:wps="http://schemas.microsoft.com/office/word/2010/wordprocessingShape" mc:Ignorable="w14 w15 w16se w16cid w16 w16cex w16sdtdh wp14">
+<w16cex:commentsExtensible xmlns:wpc="http://schemas.microsoft.com/office/word/2010/wordprocessingCanvas" xmlns:cx="http://schemas.microsoft.com/office/drawing/2014/chartex" xmlns:cx1="http://schemas.microsoft.com/office/drawing/2015/9/8/chartex" xmlns:cx2="http://schemas.microsoft.com/office/drawing/2015/10/21/chartex" xmlns:cx3="http://schemas.microsoft.com/office/drawing/2016/5/9/chartex" xmlns:cx4="http://schemas.microsoft.com/office/drawing/2016/5/10/chartex" xmlns:cx5="http://schemas.microsoft.com/office/drawing/2016/5/11/chartex" xmlns:cx6="http://schemas.microsoft.com/office/drawing/2016/5/12/chartex" xmlns:cx7="http://schemas.microsoft.com/office/drawing/2016/5/13/chartex" xmlns:cx8="http://schemas.microsoft.com/office/drawing/2016/5/14/chartex" xmlns:cr="http://schemas.microsoft.com/office/comments/2020/reactions" xmlns:mc="http://schemas.openxmlformats.org/markup-compatibility/2006" xmlns:aink="http://schemas.microsoft.com/office/drawing/2016/ink" xmlns:am3d="http://schemas.microsoft.com/office/drawing/2017/model3d" xmlns:o="urn:schemas-microsoft-com:office:office" xmlns:oel="http://schemas.microsoft.com/office/2019/extlst" xmlns:r="http://schemas.openxmlformats.org/officeDocument/2006/relationships" xmlns:m="http://schemas.openxmlformats.org/officeDocument/2006/math" xmlns:v="urn:schemas-microsoft-com:vml" xmlns:wp14="http://schemas.microsoft.com/office/word/2010/wordprocessingDrawing" xmlns:wp="http://schemas.openxmlformats.org/drawingml/2006/wordprocessingDrawing" xmlns:w10="urn:schemas-microsoft-com:office:word" xmlns:w="http://schemas.openxmlformats.org/wordprocessingml/2006/main" xmlns:w14="http://schemas.microsoft.com/office/word/2010/wordml" xmlns:w15="http://schemas.microsoft.com/office/word/2012/wordml" xmlns:w16cex="http://schemas.microsoft.com/office/word/2018/wordml/cex" xmlns:w16cid="http://schemas.microsoft.com/office/word/2016/wordml/cid" xmlns:w16="http://schemas.microsoft.com/office/word/2018/wordml" xmlns:w16du="http://schemas.microsoft.com/office/word/2023/wordml/word16du" xmlns:w16sdtdh="http://schemas.microsoft.com/office/word/2020/wordml/sdtdatahash" xmlns:w16sdtfl="http://schemas.microsoft.com/office/word/2024/wordml/sdtformatlock" xmlns:w16se="http://schemas.microsoft.com/office/word/2015/wordml/symex" xmlns:wpg="http://schemas.microsoft.com/office/word/2010/wordprocessingGroup" xmlns:wpi="http://schemas.microsoft.com/office/word/2010/wordprocessingInk" xmlns:wne="http://schemas.microsoft.com/office/word/2006/wordml" xmlns:wps="http://schemas.microsoft.com/office/word/2010/wordprocessingShape" mc:Ignorable="w14 w15 w16se w16cid w16 w16cex w16sdtdh w16sdtfl cr w16du wp14">
   <w16cex:commentExtensible w16cex:durableId="795C1F14" w16cex:dateUtc="2026-03-28T22:47:00Z"/>
   <w16cex:commentExtensible w16cex:durableId="45B7C8C5" w16cex:dateUtc="2026-03-28T22:47:00Z"/>
   <w16cex:commentExtensible w16cex:durableId="562A8B56" w16cex:dateUtc="2026-03-28T22:47:00Z"/>
@@ -2134,7 +1913,7 @@
 </file>
 
 <file path=word/commentsIds.xml><?xml version="1.0" encoding="utf-8"?>
-<w16cid:commentsIds xmlns:wpc="http://schemas.microsoft.com/office/word/2010/wordprocessingCanvas" xmlns:cx="http://schemas.microsoft.com/office/drawing/2014/chartex" xmlns:cx1="http://schemas.microsoft.com/office/drawing/2015/9/8/chartex" xmlns:cx2="http://schemas.microsoft.com/office/drawing/2015/10/21/chartex" xmlns:cx3="http://schemas.microsoft.com/office/drawing/2016/5/9/chartex" xmlns:cx4="http://schemas.microsoft.com/office/drawing/2016/5/10/chartex" xmlns:cx5="http://schemas.microsoft.com/office/drawing/2016/5/11/chartex" xmlns:cx6="http://schemas.microsoft.com/office/drawing/2016/5/12/chartex" xmlns:cx7="http://schemas.microsoft.com/office/drawing/2016/5/13/chartex" xmlns:cx8="http://schemas.microsoft.com/office/drawing/2016/5/14/chartex" xmlns:mc="http://schemas.openxmlformats.org/markup-compatibility/2006" xmlns:aink="http://schemas.microsoft.com/office/drawing/2016/ink" xmlns:am3d="http://schemas.microsoft.com/office/drawing/2017/model3d" xmlns:o="urn:schemas-microsoft-com:office:office" xmlns:oel="http://schemas.microsoft.com/office/2019/extlst" xmlns:r="http://schemas.openxmlformats.org/officeDocument/2006/relationships" xmlns:m="http://schemas.openxmlformats.org/officeDocument/2006/math" xmlns:v="urn:schemas-microsoft-com:vml" xmlns:wp14="http://schemas.microsoft.com/office/word/2010/wordprocessingDrawing" xmlns:wp="http://schemas.openxmlformats.org/drawingml/2006/wordprocessingDrawing" xmlns:w10="urn:schemas-microsoft-com:office:word" xmlns:w="http://schemas.openxmlformats.org/wordprocessingml/2006/main" xmlns:w14="http://schemas.microsoft.com/office/word/2010/wordml" xmlns:w15="http://schemas.microsoft.com/office/word/2012/wordml" xmlns:w16cex="http://schemas.microsoft.com/office/word/2018/wordml/cex" xmlns:w16cid="http://schemas.microsoft.com/office/word/2016/wordml/cid" xmlns:w16="http://schemas.microsoft.com/office/word/2018/wordml" xmlns:w16sdtdh="http://schemas.microsoft.com/office/word/2020/wordml/sdtdatahash" xmlns:w16se="http://schemas.microsoft.com/office/word/2015/wordml/symex" xmlns:wpg="http://schemas.microsoft.com/office/word/2010/wordprocessingGroup" xmlns:wpi="http://schemas.microsoft.com/office/word/2010/wordprocessingInk" xmlns:wne="http://schemas.microsoft.com/office/word/2006/wordml" xmlns:wps="http://schemas.microsoft.com/office/word/2010/wordprocessingShape" mc:Ignorable="w14 w15 w16se w16cid w16 w16cex w16sdtdh wp14">
+<w16cid:commentsIds xmlns:wpc="http://schemas.microsoft.com/office/word/2010/wordprocessingCanvas" xmlns:cx="http://schemas.microsoft.com/office/drawing/2014/chartex" xmlns:cx1="http://schemas.microsoft.com/office/drawing/2015/9/8/chartex" xmlns:cx2="http://schemas.microsoft.com/office/drawing/2015/10/21/chartex" xmlns:cx3="http://schemas.microsoft.com/office/drawing/2016/5/9/chartex" xmlns:cx4="http://schemas.microsoft.com/office/drawing/2016/5/10/chartex" xmlns:cx5="http://schemas.microsoft.com/office/drawing/2016/5/11/chartex" xmlns:cx6="http://schemas.microsoft.com/office/drawing/2016/5/12/chartex" xmlns:cx7="http://schemas.microsoft.com/office/drawing/2016/5/13/chartex" xmlns:cx8="http://schemas.microsoft.com/office/drawing/2016/5/14/chartex" xmlns:mc="http://schemas.openxmlformats.org/markup-compatibility/2006" xmlns:aink="http://schemas.microsoft.com/office/drawing/2016/ink" xmlns:am3d="http://schemas.microsoft.com/office/drawing/2017/model3d" xmlns:o="urn:schemas-microsoft-com:office:office" xmlns:oel="http://schemas.microsoft.com/office/2019/extlst" xmlns:r="http://schemas.openxmlformats.org/officeDocument/2006/relationships" xmlns:m="http://schemas.openxmlformats.org/officeDocument/2006/math" xmlns:v="urn:schemas-microsoft-com:vml" xmlns:wp14="http://schemas.microsoft.com/office/word/2010/wordprocessingDrawing" xmlns:wp="http://schemas.openxmlformats.org/drawingml/2006/wordprocessingDrawing" xmlns:w10="urn:schemas-microsoft-com:office:word" xmlns:w="http://schemas.openxmlformats.org/wordprocessingml/2006/main" xmlns:w14="http://schemas.microsoft.com/office/word/2010/wordml" xmlns:w15="http://schemas.microsoft.com/office/word/2012/wordml" xmlns:w16cex="http://schemas.microsoft.com/office/word/2018/wordml/cex" xmlns:w16cid="http://schemas.microsoft.com/office/word/2016/wordml/cid" xmlns:w16="http://schemas.microsoft.com/office/word/2018/wordml" xmlns:w16du="http://schemas.microsoft.com/office/word/2023/wordml/word16du" xmlns:w16sdtdh="http://schemas.microsoft.com/office/word/2020/wordml/sdtdatahash" xmlns:w16sdtfl="http://schemas.microsoft.com/office/word/2024/wordml/sdtformatlock" xmlns:w16se="http://schemas.microsoft.com/office/word/2015/wordml/symex" xmlns:wpg="http://schemas.microsoft.com/office/word/2010/wordprocessingGroup" xmlns:wpi="http://schemas.microsoft.com/office/word/2010/wordprocessingInk" xmlns:wne="http://schemas.microsoft.com/office/word/2006/wordml" xmlns:wps="http://schemas.microsoft.com/office/word/2010/wordprocessingShape" mc:Ignorable="w14 w15 w16se w16cid w16 w16cex w16sdtdh w16sdtfl w16du wp14">
   <w16cid:commentId w16cid:paraId="7E16C328" w16cid:durableId="795C1F14"/>
   <w16cid:commentId w16cid:paraId="62C1AAF6" w16cid:durableId="45B7C8C5"/>
   <w16cid:commentId w16cid:paraId="4FC961B7" w16cid:durableId="562A8B56"/>
@@ -2143,7 +1922,7 @@
 </file>
 
 <file path=word/numbering.xml><?xml version="1.0" encoding="utf-8"?>
-<w:numbering xmlns:wpc="http://schemas.microsoft.com/office/word/2010/wordprocessingCanvas" xmlns:cx="http://schemas.microsoft.com/office/drawing/2014/chartex" xmlns:cx1="http://schemas.microsoft.com/office/drawing/2015/9/8/chartex" xmlns:cx2="http://schemas.microsoft.com/office/drawing/2015/10/21/chartex" xmlns:cx3="http://schemas.microsoft.com/office/drawing/2016/5/9/chartex" xmlns:cx4="http://schemas.microsoft.com/office/drawing/2016/5/10/chartex" xmlns:cx5="http://schemas.microsoft.com/office/drawing/2016/5/11/chartex" xmlns:cx6="http://schemas.microsoft.com/office/drawing/2016/5/12/chartex" xmlns:cx7="http://schemas.microsoft.com/office/drawing/2016/5/13/chartex" xmlns:cx8="http://schemas.microsoft.com/office/drawing/2016/5/14/chartex" xmlns:mc="http://schemas.openxmlformats.org/markup-compatibility/2006" xmlns:aink="http://schemas.microsoft.com/office/drawing/2016/ink" xmlns:am3d="http://schemas.microsoft.com/office/drawing/2017/model3d" xmlns:o="urn:schemas-microsoft-com:office:office" xmlns:oel="http://schemas.microsoft.com/office/2019/extlst" xmlns:r="http://schemas.openxmlformats.org/officeDocument/2006/relationships" xmlns:m="http://schemas.openxmlformats.org/officeDocument/2006/math" xmlns:v="urn:schemas-microsoft-com:vml" xmlns:wp14="http://schemas.microsoft.com/office/word/2010/wordprocessingDrawing" xmlns:wp="http://schemas.openxmlformats.org/drawingml/2006/wordprocessingDrawing" xmlns:w10="urn:schemas-microsoft-com:office:word" xmlns:w="http://schemas.openxmlformats.org/wordprocessingml/2006/main" xmlns:w14="http://schemas.microsoft.com/office/word/2010/wordml" xmlns:w15="http://schemas.microsoft.com/office/word/2012/wordml" xmlns:w16cex="http://schemas.microsoft.com/office/word/2018/wordml/cex" xmlns:w16cid="http://schemas.microsoft.com/office/word/2016/wordml/cid" xmlns:w16="http://schemas.microsoft.com/office/word/2018/wordml" xmlns:w16sdtdh="http://schemas.microsoft.com/office/word/2020/wordml/sdtdatahash" xmlns:w16se="http://schemas.microsoft.com/office/word/2015/wordml/symex" xmlns:wpg="http://schemas.microsoft.com/office/word/2010/wordprocessingGroup" xmlns:wpi="http://schemas.microsoft.com/office/word/2010/wordprocessingInk" xmlns:wne="http://schemas.microsoft.com/office/word/2006/wordml" xmlns:wps="http://schemas.microsoft.com/office/word/2010/wordprocessingShape" mc:Ignorable="w14 w15 w16se w16cid w16 w16cex w16sdtdh wp14">
+<w:numbering xmlns:wpc="http://schemas.microsoft.com/office/word/2010/wordprocessingCanvas" xmlns:cx="http://schemas.microsoft.com/office/drawing/2014/chartex" xmlns:cx1="http://schemas.microsoft.com/office/drawing/2015/9/8/chartex" xmlns:cx2="http://schemas.microsoft.com/office/drawing/2015/10/21/chartex" xmlns:cx3="http://schemas.microsoft.com/office/drawing/2016/5/9/chartex" xmlns:cx4="http://schemas.microsoft.com/office/drawing/2016/5/10/chartex" xmlns:cx5="http://schemas.microsoft.com/office/drawing/2016/5/11/chartex" xmlns:cx6="http://schemas.microsoft.com/office/drawing/2016/5/12/chartex" xmlns:cx7="http://schemas.microsoft.com/office/drawing/2016/5/13/chartex" xmlns:cx8="http://schemas.microsoft.com/office/drawing/2016/5/14/chartex" xmlns:mc="http://schemas.openxmlformats.org/markup-compatibility/2006" xmlns:aink="http://schemas.microsoft.com/office/drawing/2016/ink" xmlns:am3d="http://schemas.microsoft.com/office/drawing/2017/model3d" xmlns:o="urn:schemas-microsoft-com:office:office" xmlns:oel="http://schemas.microsoft.com/office/2019/extlst" xmlns:r="http://schemas.openxmlformats.org/officeDocument/2006/relationships" xmlns:m="http://schemas.openxmlformats.org/officeDocument/2006/math" xmlns:v="urn:schemas-microsoft-com:vml" xmlns:wp14="http://schemas.microsoft.com/office/word/2010/wordprocessingDrawing" xmlns:wp="http://schemas.openxmlformats.org/drawingml/2006/wordprocessingDrawing" xmlns:w10="urn:schemas-microsoft-com:office:word" xmlns:w="http://schemas.openxmlformats.org/wordprocessingml/2006/main" xmlns:w14="http://schemas.microsoft.com/office/word/2010/wordml" xmlns:w15="http://schemas.microsoft.com/office/word/2012/wordml" xmlns:w16cex="http://schemas.microsoft.com/office/word/2018/wordml/cex" xmlns:w16cid="http://schemas.microsoft.com/office/word/2016/wordml/cid" xmlns:w16="http://schemas.microsoft.com/office/word/2018/wordml" xmlns:w16du="http://schemas.microsoft.com/office/word/2023/wordml/word16du" xmlns:w16sdtdh="http://schemas.microsoft.com/office/word/2020/wordml/sdtdatahash" xmlns:w16sdtfl="http://schemas.microsoft.com/office/word/2024/wordml/sdtformatlock" xmlns:w16se="http://schemas.microsoft.com/office/word/2015/wordml/symex" xmlns:wpg="http://schemas.microsoft.com/office/word/2010/wordprocessingGroup" xmlns:wpi="http://schemas.microsoft.com/office/word/2010/wordprocessingInk" xmlns:wne="http://schemas.microsoft.com/office/word/2006/wordml" xmlns:wps="http://schemas.microsoft.com/office/word/2010/wordprocessingShape" mc:Ignorable="w14 w15 w16se w16cid w16 w16cex w16sdtdh w16sdtfl w16du wp14">
   <w:abstractNum w:abstractNumId="0" w15:restartNumberingAfterBreak="0">
     <w:nsid w:val="0A815801"/>
     <w:multiLevelType w:val="hybridMultilevel"/>
@@ -4439,7 +4218,7 @@
 </file>
 
 <file path=word/people.xml><?xml version="1.0" encoding="utf-8"?>
-<w15:people xmlns:wpc="http://schemas.microsoft.com/office/word/2010/wordprocessingCanvas" xmlns:cx="http://schemas.microsoft.com/office/drawing/2014/chartex" xmlns:cx1="http://schemas.microsoft.com/office/drawing/2015/9/8/chartex" xmlns:cx2="http://schemas.microsoft.com/office/drawing/2015/10/21/chartex" xmlns:cx3="http://schemas.microsoft.com/office/drawing/2016/5/9/chartex" xmlns:cx4="http://schemas.microsoft.com/office/drawing/2016/5/10/chartex" xmlns:cx5="http://schemas.microsoft.com/office/drawing/2016/5/11/chartex" xmlns:cx6="http://schemas.microsoft.com/office/drawing/2016/5/12/chartex" xmlns:cx7="http://schemas.microsoft.com/office/drawing/2016/5/13/chartex" xmlns:cx8="http://schemas.microsoft.com/office/drawing/2016/5/14/chartex" xmlns:mc="http://schemas.openxmlformats.org/markup-compatibility/2006" xmlns:aink="http://schemas.microsoft.com/office/drawing/2016/ink" xmlns:am3d="http://schemas.microsoft.com/office/drawing/2017/model3d" xmlns:o="urn:schemas-microsoft-com:office:office" xmlns:oel="http://schemas.microsoft.com/office/2019/extlst" xmlns:r="http://schemas.openxmlformats.org/officeDocument/2006/relationships" xmlns:m="http://schemas.openxmlformats.org/officeDocument/2006/math" xmlns:v="urn:schemas-microsoft-com:vml" xmlns:wp14="http://schemas.microsoft.com/office/word/2010/wordprocessingDrawing" xmlns:wp="http://schemas.openxmlformats.org/drawingml/2006/wordprocessingDrawing" xmlns:w10="urn:schemas-microsoft-com:office:word" xmlns:w="http://schemas.openxmlformats.org/wordprocessingml/2006/main" xmlns:w14="http://schemas.microsoft.com/office/word/2010/wordml" xmlns:w15="http://schemas.microsoft.com/office/word/2012/wordml" xmlns:w16cex="http://schemas.microsoft.com/office/word/2018/wordml/cex" xmlns:w16cid="http://schemas.microsoft.com/office/word/2016/wordml/cid" xmlns:w16="http://schemas.microsoft.com/office/word/2018/wordml" xmlns:w16sdtdh="http://schemas.microsoft.com/office/word/2020/wordml/sdtdatahash" xmlns:w16se="http://schemas.microsoft.com/office/word/2015/wordml/symex" xmlns:wpg="http://schemas.microsoft.com/office/word/2010/wordprocessingGroup" xmlns:wpi="http://schemas.microsoft.com/office/word/2010/wordprocessingInk" xmlns:wne="http://schemas.microsoft.com/office/word/2006/wordml" xmlns:wps="http://schemas.microsoft.com/office/word/2010/wordprocessingShape" mc:Ignorable="w14 w15 w16se w16cid w16 w16cex w16sdtdh wp14">
+<w15:people xmlns:wpc="http://schemas.microsoft.com/office/word/2010/wordprocessingCanvas" xmlns:cx="http://schemas.microsoft.com/office/drawing/2014/chartex" xmlns:cx1="http://schemas.microsoft.com/office/drawing/2015/9/8/chartex" xmlns:cx2="http://schemas.microsoft.com/office/drawing/2015/10/21/chartex" xmlns:cx3="http://schemas.microsoft.com/office/drawing/2016/5/9/chartex" xmlns:cx4="http://schemas.microsoft.com/office/drawing/2016/5/10/chartex" xmlns:cx5="http://schemas.microsoft.com/office/drawing/2016/5/11/chartex" xmlns:cx6="http://schemas.microsoft.com/office/drawing/2016/5/12/chartex" xmlns:cx7="http://schemas.microsoft.com/office/drawing/2016/5/13/chartex" xmlns:cx8="http://schemas.microsoft.com/office/drawing/2016/5/14/chartex" xmlns:mc="http://schemas.openxmlformats.org/markup-compatibility/2006" xmlns:aink="http://schemas.microsoft.com/office/drawing/2016/ink" xmlns:am3d="http://schemas.microsoft.com/office/drawing/2017/model3d" xmlns:o="urn:schemas-microsoft-com:office:office" xmlns:oel="http://schemas.microsoft.com/office/2019/extlst" xmlns:r="http://schemas.openxmlformats.org/officeDocument/2006/relationships" xmlns:m="http://schemas.openxmlformats.org/officeDocument/2006/math" xmlns:v="urn:schemas-microsoft-com:vml" xmlns:wp14="http://schemas.microsoft.com/office/word/2010/wordprocessingDrawing" xmlns:wp="http://schemas.openxmlformats.org/drawingml/2006/wordprocessingDrawing" xmlns:w10="urn:schemas-microsoft-com:office:word" xmlns:w="http://schemas.openxmlformats.org/wordprocessingml/2006/main" xmlns:w14="http://schemas.microsoft.com/office/word/2010/wordml" xmlns:w15="http://schemas.microsoft.com/office/word/2012/wordml" xmlns:w16cex="http://schemas.microsoft.com/office/word/2018/wordml/cex" xmlns:w16cid="http://schemas.microsoft.com/office/word/2016/wordml/cid" xmlns:w16="http://schemas.microsoft.com/office/word/2018/wordml" xmlns:w16du="http://schemas.microsoft.com/office/word/2023/wordml/word16du" xmlns:w16sdtdh="http://schemas.microsoft.com/office/word/2020/wordml/sdtdatahash" xmlns:w16sdtfl="http://schemas.microsoft.com/office/word/2024/wordml/sdtformatlock" xmlns:w16se="http://schemas.microsoft.com/office/word/2015/wordml/symex" xmlns:wpg="http://schemas.microsoft.com/office/word/2010/wordprocessingGroup" xmlns:wpi="http://schemas.microsoft.com/office/word/2010/wordprocessingInk" xmlns:wne="http://schemas.microsoft.com/office/word/2006/wordml" xmlns:wps="http://schemas.microsoft.com/office/word/2010/wordprocessingShape" mc:Ignorable="w14 w15 w16se w16cid w16 w16cex w16sdtdh w16sdtfl w16du wp14">
   <w15:person w15:author="Helen Nguyen">
     <w15:presenceInfo w15:providerId="AD" w15:userId="S::nganguyen@usf.edu::1112739b-77dc-448a-8744-257d55cee90b"/>
   </w15:person>
@@ -4447,7 +4226,7 @@
 </file>
 
 <file path=word/styles.xml><?xml version="1.0" encoding="utf-8"?>
-<w:styles xmlns:mc="http://schemas.openxmlformats.org/markup-compatibility/2006" xmlns:r="http://schemas.openxmlformats.org/officeDocument/2006/relationships" xmlns:w="http://schemas.openxmlformats.org/wordprocessingml/2006/main" xmlns:w14="http://schemas.microsoft.com/office/word/2010/wordml" xmlns:w15="http://schemas.microsoft.com/office/word/2012/wordml" xmlns:w16cex="http://schemas.microsoft.com/office/word/2018/wordml/cex" xmlns:w16cid="http://schemas.microsoft.com/office/word/2016/wordml/cid" xmlns:w16="http://schemas.microsoft.com/office/word/2018/wordml" xmlns:w16sdtdh="http://schemas.microsoft.com/office/word/2020/wordml/sdtdatahash" xmlns:w16se="http://schemas.microsoft.com/office/word/2015/wordml/symex" mc:Ignorable="w14 w15 w16se w16cid w16 w16cex w16sdtdh">
+<w:styles xmlns:mc="http://schemas.openxmlformats.org/markup-compatibility/2006" xmlns:r="http://schemas.openxmlformats.org/officeDocument/2006/relationships" xmlns:w="http://schemas.openxmlformats.org/wordprocessingml/2006/main" xmlns:w14="http://schemas.microsoft.com/office/word/2010/wordml" xmlns:w15="http://schemas.microsoft.com/office/word/2012/wordml" xmlns:w16cex="http://schemas.microsoft.com/office/word/2018/wordml/cex" xmlns:w16cid="http://schemas.microsoft.com/office/word/2016/wordml/cid" xmlns:w16="http://schemas.microsoft.com/office/word/2018/wordml" xmlns:w16du="http://schemas.microsoft.com/office/word/2023/wordml/word16du" xmlns:w16sdtdh="http://schemas.microsoft.com/office/word/2020/wordml/sdtdatahash" xmlns:w16sdtfl="http://schemas.microsoft.com/office/word/2024/wordml/sdtformatlock" xmlns:w16se="http://schemas.microsoft.com/office/word/2015/wordml/symex" mc:Ignorable="w14 w15 w16se w16cid w16 w16cex w16sdtdh w16sdtfl w16du">
   <w:docDefaults>
     <w:rPrDefault>
       <w:rPr>

</xml_diff>